<commit_message>
feat: alinear botones selector módulos, tabs position correctos, docs actualizados v21
- ModuleSelector: flex+marginTop:auto para alinear botones Entrar al fondo de cada card
- Tabs Position Trading: Análisis/Scorecard/Sizing/Journal → Watchlist/Screener/Mercado/Journal/Dashboard
- Descripción corregida: "8 criterios" → "7 criterios"
- Doc: contexto-proyecto.md y mejoras-potenciales.txt actualizados a v21.0
- Doc: swing-agent-arquitectura.docx y guia-inversionista-swing-agent.docx regenerados v21.0
- Doc: versiones .md de los docx (swing-agent-arquitectura.md, guia-inversionista-swing-agent.md)
- Doc: logica-estrategias-inversion.md — lógica completa de ambas estrategias para revisión experta

Co-Authored-By: Claude Sonnet 4.6 <noreply@anthropic.com>
</commit_message>
<xml_diff>
--- a/Doc/guia-inversionista-swing-agent.docx
+++ b/Doc/guia-inversionista-swing-agent.docx
@@ -4,15 +4,15 @@
   <w:body>
     <w:p>
       <w:pPr>
-        <w:pStyle w:val="Heading1"/>
+        <w:pStyle w:val="Title"/>
       </w:pPr>
       <w:r>
-        <w:t>Guía del Inversionista — Cómo usar el Swing Trading Agent v18.0</w:t>
+        <w:t>Guía del Inversionista — KNNS TradeAgent v21.0</w:t>
       </w:r>
     </w:p>
     <w:p>
       <w:pPr>
-        <w:pStyle w:val="Heading2"/>
+        <w:pStyle w:val="Heading1"/>
       </w:pPr>
       <w:r>
         <w:t>Flujo de uso recomendado</w:t>
@@ -32,8 +32,7 @@
       <w:tr>
         <w:tc>
           <w:tcPr>
-            <w:tcW w:type="dxa" w:w="720"/>
-            <w:shd w:val="clear" w:color="auto" w:fill="DAEEF3"/>
+            <w:tcW w:type="dxa" w:w="2880"/>
           </w:tcPr>
           <w:p>
             <w:r>
@@ -46,22 +45,20 @@
         </w:tc>
         <w:tc>
           <w:tcPr>
-            <w:tcW w:type="dxa" w:w="2160"/>
-            <w:shd w:val="clear" w:color="auto" w:fill="DAEEF3"/>
+            <w:tcW w:type="dxa" w:w="2880"/>
           </w:tcPr>
           <w:p>
             <w:r>
               <w:rPr>
                 <w:b/>
               </w:rPr>
-              <w:t>Pestaña</w:t>
+              <w:t>Módulo / Pestaña</w:t>
             </w:r>
           </w:p>
         </w:tc>
         <w:tc>
           <w:tcPr>
-            <w:tcW w:type="dxa" w:w="6480"/>
-            <w:shd w:val="clear" w:color="auto" w:fill="DAEEF3"/>
+            <w:tcW w:type="dxa" w:w="2880"/>
           </w:tcPr>
           <w:p>
             <w:r>
@@ -76,7 +73,187 @@
       <w:tr>
         <w:tc>
           <w:tcPr>
-            <w:tcW w:type="dxa" w:w="720"/>
+            <w:tcW w:type="dxa" w:w="2880"/>
+          </w:tcPr>
+          <w:p/>
+        </w:tc>
+        <w:tc>
+          <w:tcPr>
+            <w:tcW w:type="dxa" w:w="2880"/>
+          </w:tcPr>
+          <w:p/>
+        </w:tc>
+        <w:tc>
+          <w:tcPr>
+            <w:tcW w:type="dxa" w:w="2880"/>
+          </w:tcPr>
+          <w:p/>
+        </w:tc>
+      </w:tr>
+      <w:tr>
+        <w:tc>
+          <w:tcPr>
+            <w:tcW w:type="dxa" w:w="2880"/>
+          </w:tcPr>
+          <w:p/>
+        </w:tc>
+        <w:tc>
+          <w:tcPr>
+            <w:tcW w:type="dxa" w:w="2880"/>
+          </w:tcPr>
+          <w:p/>
+        </w:tc>
+        <w:tc>
+          <w:tcPr>
+            <w:tcW w:type="dxa" w:w="2880"/>
+          </w:tcPr>
+          <w:p/>
+        </w:tc>
+      </w:tr>
+      <w:tr>
+        <w:tc>
+          <w:tcPr>
+            <w:tcW w:type="dxa" w:w="2880"/>
+          </w:tcPr>
+          <w:p/>
+        </w:tc>
+        <w:tc>
+          <w:tcPr>
+            <w:tcW w:type="dxa" w:w="2880"/>
+          </w:tcPr>
+          <w:p/>
+        </w:tc>
+        <w:tc>
+          <w:tcPr>
+            <w:tcW w:type="dxa" w:w="2880"/>
+          </w:tcPr>
+          <w:p/>
+        </w:tc>
+      </w:tr>
+      <w:tr>
+        <w:tc>
+          <w:tcPr>
+            <w:tcW w:type="dxa" w:w="2880"/>
+          </w:tcPr>
+          <w:p/>
+        </w:tc>
+        <w:tc>
+          <w:tcPr>
+            <w:tcW w:type="dxa" w:w="2880"/>
+          </w:tcPr>
+          <w:p/>
+        </w:tc>
+        <w:tc>
+          <w:tcPr>
+            <w:tcW w:type="dxa" w:w="2880"/>
+          </w:tcPr>
+          <w:p/>
+        </w:tc>
+      </w:tr>
+      <w:tr>
+        <w:tc>
+          <w:tcPr>
+            <w:tcW w:type="dxa" w:w="2880"/>
+          </w:tcPr>
+          <w:p/>
+        </w:tc>
+        <w:tc>
+          <w:tcPr>
+            <w:tcW w:type="dxa" w:w="2880"/>
+          </w:tcPr>
+          <w:p/>
+        </w:tc>
+        <w:tc>
+          <w:tcPr>
+            <w:tcW w:type="dxa" w:w="2880"/>
+          </w:tcPr>
+          <w:p/>
+        </w:tc>
+      </w:tr>
+      <w:tr>
+        <w:tc>
+          <w:tcPr>
+            <w:tcW w:type="dxa" w:w="2880"/>
+          </w:tcPr>
+          <w:p/>
+        </w:tc>
+        <w:tc>
+          <w:tcPr>
+            <w:tcW w:type="dxa" w:w="2880"/>
+          </w:tcPr>
+          <w:p/>
+        </w:tc>
+        <w:tc>
+          <w:tcPr>
+            <w:tcW w:type="dxa" w:w="2880"/>
+          </w:tcPr>
+          <w:p/>
+        </w:tc>
+      </w:tr>
+      <w:tr>
+        <w:tc>
+          <w:tcPr>
+            <w:tcW w:type="dxa" w:w="2880"/>
+          </w:tcPr>
+          <w:p/>
+        </w:tc>
+        <w:tc>
+          <w:tcPr>
+            <w:tcW w:type="dxa" w:w="2880"/>
+          </w:tcPr>
+          <w:p/>
+        </w:tc>
+        <w:tc>
+          <w:tcPr>
+            <w:tcW w:type="dxa" w:w="2880"/>
+          </w:tcPr>
+          <w:p/>
+        </w:tc>
+      </w:tr>
+      <w:tr>
+        <w:tc>
+          <w:tcPr>
+            <w:tcW w:type="dxa" w:w="2880"/>
+          </w:tcPr>
+          <w:p/>
+        </w:tc>
+        <w:tc>
+          <w:tcPr>
+            <w:tcW w:type="dxa" w:w="2880"/>
+          </w:tcPr>
+          <w:p/>
+        </w:tc>
+        <w:tc>
+          <w:tcPr>
+            <w:tcW w:type="dxa" w:w="2880"/>
+          </w:tcPr>
+          <w:p/>
+        </w:tc>
+      </w:tr>
+      <w:tr>
+        <w:tc>
+          <w:tcPr>
+            <w:tcW w:type="dxa" w:w="2880"/>
+          </w:tcPr>
+          <w:p/>
+        </w:tc>
+        <w:tc>
+          <w:tcPr>
+            <w:tcW w:type="dxa" w:w="2880"/>
+          </w:tcPr>
+          <w:p/>
+        </w:tc>
+        <w:tc>
+          <w:tcPr>
+            <w:tcW w:type="dxa" w:w="2880"/>
+          </w:tcPr>
+          <w:p/>
+        </w:tc>
+      </w:tr>
+      <w:tr>
+        <w:tc>
+          <w:tcPr>
+            <w:tcW w:type="dxa" w:w="2880"/>
           </w:tcPr>
           <w:p>
             <w:r>
@@ -86,21 +263,21 @@
         </w:tc>
         <w:tc>
           <w:tcPr>
-            <w:tcW w:type="dxa" w:w="2160"/>
+            <w:tcW w:type="dxa" w:w="2880"/>
           </w:tcPr>
           <w:p>
             <w:r>
-              <w:t>Screener</w:t>
+              <w:t>Selector</w:t>
             </w:r>
           </w:p>
         </w:tc>
         <w:tc>
           <w:tcPr>
-            <w:tcW w:type="dxa" w:w="6480"/>
+            <w:tcW w:type="dxa" w:w="2880"/>
           </w:tcPr>
           <w:p>
             <w:r>
-              <w:t>Revisar candidatas del día. Filtrar por sector. Usar '+Agregar' individual o 'Agregar todos' para añadir múltiples acciones a la Watchlist.</w:t>
+              <w:t>Elegir Swing Trading o Position Trading según el horizonte temporal.</w:t>
             </w:r>
           </w:p>
         </w:tc>
@@ -108,31 +285,31 @@
       <w:tr>
         <w:tc>
           <w:tcPr>
-            <w:tcW w:type="dxa" w:w="720"/>
+            <w:tcW w:type="dxa" w:w="2880"/>
           </w:tcPr>
           <w:p>
             <w:r>
-              <w:t>2</w:t>
+              <w:t>2 (Swing)</w:t>
             </w:r>
           </w:p>
         </w:tc>
         <w:tc>
           <w:tcPr>
-            <w:tcW w:type="dxa" w:w="2160"/>
+            <w:tcW w:type="dxa" w:w="2880"/>
           </w:tcPr>
           <w:p>
             <w:r>
-              <w:t>Watchlist</w:t>
+              <w:t>Screener Swing</w:t>
             </w:r>
           </w:p>
         </w:tc>
         <w:tc>
           <w:tcPr>
-            <w:tcW w:type="dxa" w:w="6480"/>
+            <w:tcW w:type="dxa" w:w="2880"/>
           </w:tcPr>
           <w:p>
             <w:r>
-              <w:t>Analizar cada acción. Revisar señal, estrellas de contexto, score y alertas. Si hay badge 'TRADE ACTIVO' o 'Último trade cerrado', tomar eso en cuenta antes de operar.</w:t>
+              <w:t>Revisar candidatas del día. Filtrar por sector. Agregar a watchlist.</w:t>
             </w:r>
           </w:p>
         </w:tc>
@@ -140,31 +317,31 @@
       <w:tr>
         <w:tc>
           <w:tcPr>
-            <w:tcW w:type="dxa" w:w="720"/>
+            <w:tcW w:type="dxa" w:w="2880"/>
           </w:tcPr>
           <w:p>
             <w:r>
-              <w:t>3</w:t>
+              <w:t>3 (Swing)</w:t>
             </w:r>
           </w:p>
         </w:tc>
         <w:tc>
           <w:tcPr>
-            <w:tcW w:type="dxa" w:w="2160"/>
+            <w:tcW w:type="dxa" w:w="2880"/>
           </w:tcPr>
           <w:p>
             <w:r>
-              <w:t>Watchlist</w:t>
+              <w:t>Watchlist Swing</w:t>
             </w:r>
           </w:p>
         </w:tc>
         <w:tc>
           <w:tcPr>
-            <w:tcW w:type="dxa" w:w="6480"/>
+            <w:tcW w:type="dxa" w:w="2880"/>
           </w:tcPr>
           <w:p>
             <w:r>
-              <w:t>Señal COMPRAR con buenas estrellas: revisar badge de entryZone (Método A u B). Método A (in_zone): entrar con orden de mercado. Método B (wait_pullback): poner orden límite y mover a En Seguimiento.</w:t>
+              <w:t>Analizar cada acción. Revisar señal, estrellas de contexto, score y alertas. Verificar badge entryZone.</w:t>
             </w:r>
           </w:p>
         </w:tc>
@@ -172,17 +349,17 @@
       <w:tr>
         <w:tc>
           <w:tcPr>
-            <w:tcW w:type="dxa" w:w="720"/>
+            <w:tcW w:type="dxa" w:w="2880"/>
           </w:tcPr>
           <w:p>
             <w:r>
-              <w:t>3b</w:t>
+              <w:t>4 (Swing)</w:t>
             </w:r>
           </w:p>
         </w:tc>
         <w:tc>
           <w:tcPr>
-            <w:tcW w:type="dxa" w:w="2160"/>
+            <w:tcW w:type="dxa" w:w="2880"/>
           </w:tcPr>
           <w:p>
             <w:r>
@@ -192,11 +369,11 @@
         </w:tc>
         <w:tc>
           <w:tcPr>
-            <w:tcW w:type="dxa" w:w="6480"/>
+            <w:tcW w:type="dxa" w:w="2880"/>
           </w:tcPr>
           <w:p>
             <w:r>
-              <w:t>Re-analizar tras el evento (earnings, pullback RSI). Si mejora la señal, operar. También aquí van las acciones con wait_pullback (Método B) esperando su entrada.</w:t>
+              <w:t>Acciones con Método B (wait_pullback) o MONITOREAR. Re-analizar tras el evento.</w:t>
             </w:r>
           </w:p>
         </w:tc>
@@ -204,31 +381,31 @@
       <w:tr>
         <w:tc>
           <w:tcPr>
-            <w:tcW w:type="dxa" w:w="720"/>
+            <w:tcW w:type="dxa" w:w="2880"/>
           </w:tcPr>
           <w:p>
             <w:r>
-              <w:t>4</w:t>
+              <w:t>5 (Swing)</w:t>
             </w:r>
           </w:p>
         </w:tc>
         <w:tc>
           <w:tcPr>
-            <w:tcW w:type="dxa" w:w="2160"/>
+            <w:tcW w:type="dxa" w:w="2880"/>
           </w:tcPr>
           <w:p>
             <w:r>
-              <w:t>Journal</w:t>
+              <w:t>Journal Swing</w:t>
             </w:r>
           </w:p>
         </w:tc>
         <w:tc>
           <w:tcPr>
-            <w:tcW w:type="dxa" w:w="6480"/>
+            <w:tcW w:type="dxa" w:w="2880"/>
           </w:tcPr>
           <w:p>
             <w:r>
-              <w:t>Registrar precio real de entrada, N° acciones, SL real y TP real del broker.</w:t>
+              <w:t>Registrar entrada real, N° acciones, SL real y TP real del broker.</w:t>
             </w:r>
           </w:p>
         </w:tc>
@@ -236,36 +413,140 @@
       <w:tr>
         <w:tc>
           <w:tcPr>
-            <w:tcW w:type="dxa" w:w="720"/>
+            <w:tcW w:type="dxa" w:w="2880"/>
           </w:tcPr>
           <w:p>
             <w:r>
-              <w:t>5</w:t>
+              <w:t>1 (Position)</w:t>
             </w:r>
           </w:p>
         </w:tc>
         <w:tc>
           <w:tcPr>
-            <w:tcW w:type="dxa" w:w="2160"/>
+            <w:tcW w:type="dxa" w:w="2880"/>
           </w:tcPr>
           <w:p>
             <w:r>
-              <w:t>Journal</w:t>
+              <w:t>Screener Position</w:t>
             </w:r>
           </w:p>
         </w:tc>
         <w:tc>
           <w:tcPr>
-            <w:tcW w:type="dxa" w:w="6480"/>
+            <w:tcW w:type="dxa" w:w="2880"/>
           </w:tcPr>
           <w:p>
             <w:r>
-              <w:t>Al cerrar: registrar precio de cierre → P&amp;L automático en % y USD.</w:t>
+              <w:t>Revisar candidatas de la semana (actualizado lunes). Filtrar por sector, agregar a watchlist.</w:t>
+            </w:r>
+          </w:p>
+        </w:tc>
+      </w:tr>
+      <w:tr>
+        <w:tc>
+          <w:tcPr>
+            <w:tcW w:type="dxa" w:w="2880"/>
+          </w:tcPr>
+          <w:p>
+            <w:r>
+              <w:t>2 (Position)</w:t>
+            </w:r>
+          </w:p>
+        </w:tc>
+        <w:tc>
+          <w:tcPr>
+            <w:tcW w:type="dxa" w:w="2880"/>
+          </w:tcPr>
+          <w:p>
+            <w:r>
+              <w:t>Watchlist Position</w:t>
+            </w:r>
+          </w:p>
+        </w:tc>
+        <w:tc>
+          <w:tcPr>
+            <w:tcW w:type="dxa" w:w="2880"/>
+          </w:tcPr>
+          <w:p>
+            <w:r>
+              <w:t>Analizar cada candidata. Revisar score/51, decisión, vetos, sizing calculator.</w:t>
+            </w:r>
+          </w:p>
+        </w:tc>
+      </w:tr>
+      <w:tr>
+        <w:tc>
+          <w:tcPr>
+            <w:tcW w:type="dxa" w:w="2880"/>
+          </w:tcPr>
+          <w:p>
+            <w:r>
+              <w:t>3 (Position)</w:t>
+            </w:r>
+          </w:p>
+        </w:tc>
+        <w:tc>
+          <w:tcPr>
+            <w:tcW w:type="dxa" w:w="2880"/>
+          </w:tcPr>
+          <w:p>
+            <w:r>
+              <w:t>Mercado (Sector Rotation)</w:t>
+            </w:r>
+          </w:p>
+        </w:tc>
+        <w:tc>
+          <w:tcPr>
+            <w:tcW w:type="dxa" w:w="2880"/>
+          </w:tcPr>
+          <w:p>
+            <w:r>
+              <w:t>Revisar qué sectores lideran vs SPY. Priorizar candidatas en sectores fuertes.</w:t>
+            </w:r>
+          </w:p>
+        </w:tc>
+      </w:tr>
+      <w:tr>
+        <w:tc>
+          <w:tcPr>
+            <w:tcW w:type="dxa" w:w="2880"/>
+          </w:tcPr>
+          <w:p>
+            <w:r>
+              <w:t>4 (Position)</w:t>
+            </w:r>
+          </w:p>
+        </w:tc>
+        <w:tc>
+          <w:tcPr>
+            <w:tcW w:type="dxa" w:w="2880"/>
+          </w:tcPr>
+          <w:p>
+            <w:r>
+              <w:t>Journal Position</w:t>
+            </w:r>
+          </w:p>
+        </w:tc>
+        <w:tc>
+          <w:tcPr>
+            <w:tcW w:type="dxa" w:w="2880"/>
+          </w:tcPr>
+          <w:p>
+            <w:r>
+              <w:t>Registrar tesis, entrada, stop, target, acciones.</w:t>
             </w:r>
           </w:p>
         </w:tc>
       </w:tr>
     </w:tbl>
+    <w:p>
+      <w:pPr>
+        <w:pStyle w:val="Heading1"/>
+      </w:pPr>
+      <w:r>
+        <w:t>MÓDULO SWING TRADING</w:t>
+      </w:r>
+    </w:p>
     <w:p>
       <w:pPr>
         <w:pStyle w:val="Heading2"/>
@@ -275,83 +556,17 @@
       </w:r>
     </w:p>
     <w:p>
-      <w:pPr>
-        <w:pStyle w:val="ListBullet"/>
-      </w:pPr>
       <w:r>
-        <w:t>Lista de acciones candidatas que cumplen criterios de swing trading.</w:t>
-      </w:r>
-    </w:p>
-    <w:p>
-      <w:pPr>
-        <w:pStyle w:val="ListBullet"/>
-      </w:pPr>
-      <w:r>
-        <w:t>Se actualiza automáticamente a las 9:30am ET (lunes a viernes) vía GitHub Actions.</w:t>
-      </w:r>
-    </w:p>
-    <w:p>
-      <w:pPr>
-        <w:pStyle w:val="ListBullet"/>
-      </w:pPr>
-      <w:r>
-        <w:t>Solo muestra acciones individuales de empresas — ETFs excluidos desde el origen.</w:t>
-      </w:r>
-    </w:p>
-    <w:p>
-      <w:pPr>
-        <w:pStyle w:val="ListBullet"/>
-      </w:pPr>
-      <w:r>
-        <w:t>Badge verde 'FINVIZ LIVE': candidatas reales. Criterios en Finviz: ta_ema20_cross50a (proxy de SMA21&gt;SMA50), RSI 30-60, precio &gt;$20, volumen promedio &gt;500k, solo acciones individuales (parámetro ind_stocksonly). Nota: Finviz no tiene filtro nativo SMA21, se usa el cruce EMA20&gt;EMA50 como aproximación; el análisis interno usa SMA21 y SMA50.</w:t>
-      </w:r>
-    </w:p>
-    <w:p>
-      <w:pPr>
-        <w:pStyle w:val="ListBullet"/>
-      </w:pPr>
-      <w:r>
-        <w:t>Badge amarillo 'LISTA CURADA': fallback cuando Finviz no está disponible.</w:t>
-      </w:r>
-    </w:p>
-    <w:p>
-      <w:pPr>
-        <w:pStyle w:val="ListBullet"/>
-      </w:pPr>
-      <w:r>
-        <w:t>Botón '↻ Actualizar screener': dispara el screener manualmente. Tarda ~60 segundos en completarse.</w:t>
-      </w:r>
-    </w:p>
-    <w:p>
-      <w:pPr>
-        <w:pStyle w:val="ListBullet"/>
-      </w:pPr>
-      <w:r>
-        <w:t>Filtro por sector: concentra la búsqueda en un área específica.</w:t>
-      </w:r>
-    </w:p>
-    <w:p>
-      <w:pPr>
-        <w:pStyle w:val="ListBullet"/>
-      </w:pPr>
-      <w:r>
-        <w:t>Botón '+ Agregar todos a watchlist': agrega todas las visibles (según filtro de sector) que no estén ya en watchlist.</w:t>
-      </w:r>
-    </w:p>
-    <w:p>
-      <w:pPr>
-        <w:pStyle w:val="ListBullet"/>
-      </w:pPr>
-      <w:r>
-        <w:t>Botón '− Quitar todos de watchlist': quita todas las visibles que estén en watchlist.</w:t>
-      </w:r>
-    </w:p>
-    <w:p>
-      <w:pPr>
-        <w:pStyle w:val="ListBullet"/>
-      </w:pPr>
-      <w:r>
-        <w:t>Botón individual: muestra '+ Agregar' o '− Quitar' según el estado de la acción en la watchlist.</w:t>
+        <w:t>Lista de acciones candidatas que cumplen criterios de swing trading. Se actualiza automáticamente a las 9:30am ET (lunes a viernes) vía GitHub Actions. Solo muestra acciones individuales — ETFs excluidos desde el origen.</w:t>
+        <w:br/>
+        <w:br/>
+        <w:t>Badge verde "FINVIZ LIVE": candidatas reales de Finviz.</w:t>
+        <w:br/>
+        <w:t>Badge amarillo "LISTA CURADA": fallback cuando Finviz no está disponible.</w:t>
+        <w:br/>
+        <w:t>Botón ↻ Actualizar screener: dispara el screener manualmente (~60 segundos).</w:t>
+        <w:br/>
+        <w:t>Filtro por sector. Botones "Agregar todos" / "Quitar todos".</w:t>
       </w:r>
     </w:p>
     <w:p>
@@ -360,12 +575,6 @@
       </w:pPr>
       <w:r>
         <w:t>2. Pestaña Watchlist — Cómo leer el análisis</w:t>
-      </w:r>
-    </w:p>
-    <w:p>
-      <w:pPr/>
-      <w:r>
-        <w:t>La señal y el nivel de confianza:</w:t>
       </w:r>
     </w:p>
     <w:tbl>
@@ -382,8 +591,7 @@
       <w:tr>
         <w:tc>
           <w:tcPr>
-            <w:tcW w:type="dxa" w:w="1872"/>
-            <w:shd w:val="clear" w:color="auto" w:fill="DAEEF3"/>
+            <w:tcW w:type="dxa" w:w="2880"/>
           </w:tcPr>
           <w:p>
             <w:r>
@@ -396,22 +604,20 @@
         </w:tc>
         <w:tc>
           <w:tcPr>
-            <w:tcW w:type="dxa" w:w="2448"/>
-            <w:shd w:val="clear" w:color="auto" w:fill="DAEEF3"/>
+            <w:tcW w:type="dxa" w:w="2880"/>
           </w:tcPr>
           <w:p>
             <w:r>
               <w:rPr>
                 <w:b/>
               </w:rPr>
-              <w:t>Confianza (contexto)</w:t>
+              <w:t>Contexto</w:t>
             </w:r>
           </w:p>
         </w:tc>
         <w:tc>
           <w:tcPr>
-            <w:tcW w:type="dxa" w:w="5040"/>
-            <w:shd w:val="clear" w:color="auto" w:fill="DAEEF3"/>
+            <w:tcW w:type="dxa" w:w="2880"/>
           </w:tcPr>
           <w:p>
             <w:r>
@@ -426,7 +632,127 @@
       <w:tr>
         <w:tc>
           <w:tcPr>
-            <w:tcW w:type="dxa" w:w="1872"/>
+            <w:tcW w:type="dxa" w:w="2880"/>
+          </w:tcPr>
+          <w:p/>
+        </w:tc>
+        <w:tc>
+          <w:tcPr>
+            <w:tcW w:type="dxa" w:w="2880"/>
+          </w:tcPr>
+          <w:p/>
+        </w:tc>
+        <w:tc>
+          <w:tcPr>
+            <w:tcW w:type="dxa" w:w="2880"/>
+          </w:tcPr>
+          <w:p/>
+        </w:tc>
+      </w:tr>
+      <w:tr>
+        <w:tc>
+          <w:tcPr>
+            <w:tcW w:type="dxa" w:w="2880"/>
+          </w:tcPr>
+          <w:p/>
+        </w:tc>
+        <w:tc>
+          <w:tcPr>
+            <w:tcW w:type="dxa" w:w="2880"/>
+          </w:tcPr>
+          <w:p/>
+        </w:tc>
+        <w:tc>
+          <w:tcPr>
+            <w:tcW w:type="dxa" w:w="2880"/>
+          </w:tcPr>
+          <w:p/>
+        </w:tc>
+      </w:tr>
+      <w:tr>
+        <w:tc>
+          <w:tcPr>
+            <w:tcW w:type="dxa" w:w="2880"/>
+          </w:tcPr>
+          <w:p/>
+        </w:tc>
+        <w:tc>
+          <w:tcPr>
+            <w:tcW w:type="dxa" w:w="2880"/>
+          </w:tcPr>
+          <w:p/>
+        </w:tc>
+        <w:tc>
+          <w:tcPr>
+            <w:tcW w:type="dxa" w:w="2880"/>
+          </w:tcPr>
+          <w:p/>
+        </w:tc>
+      </w:tr>
+      <w:tr>
+        <w:tc>
+          <w:tcPr>
+            <w:tcW w:type="dxa" w:w="2880"/>
+          </w:tcPr>
+          <w:p/>
+        </w:tc>
+        <w:tc>
+          <w:tcPr>
+            <w:tcW w:type="dxa" w:w="2880"/>
+          </w:tcPr>
+          <w:p/>
+        </w:tc>
+        <w:tc>
+          <w:tcPr>
+            <w:tcW w:type="dxa" w:w="2880"/>
+          </w:tcPr>
+          <w:p/>
+        </w:tc>
+      </w:tr>
+      <w:tr>
+        <w:tc>
+          <w:tcPr>
+            <w:tcW w:type="dxa" w:w="2880"/>
+          </w:tcPr>
+          <w:p/>
+        </w:tc>
+        <w:tc>
+          <w:tcPr>
+            <w:tcW w:type="dxa" w:w="2880"/>
+          </w:tcPr>
+          <w:p/>
+        </w:tc>
+        <w:tc>
+          <w:tcPr>
+            <w:tcW w:type="dxa" w:w="2880"/>
+          </w:tcPr>
+          <w:p/>
+        </w:tc>
+      </w:tr>
+      <w:tr>
+        <w:tc>
+          <w:tcPr>
+            <w:tcW w:type="dxa" w:w="2880"/>
+          </w:tcPr>
+          <w:p/>
+        </w:tc>
+        <w:tc>
+          <w:tcPr>
+            <w:tcW w:type="dxa" w:w="2880"/>
+          </w:tcPr>
+          <w:p/>
+        </w:tc>
+        <w:tc>
+          <w:tcPr>
+            <w:tcW w:type="dxa" w:w="2880"/>
+          </w:tcPr>
+          <w:p/>
+        </w:tc>
+      </w:tr>
+      <w:tr>
+        <w:tc>
+          <w:tcPr>
+            <w:tcW w:type="dxa" w:w="2880"/>
           </w:tcPr>
           <w:p>
             <w:r>
@@ -436,17 +762,17 @@
         </w:tc>
         <w:tc>
           <w:tcPr>
-            <w:tcW w:type="dxa" w:w="2448"/>
+            <w:tcW w:type="dxa" w:w="2880"/>
           </w:tcPr>
           <w:p>
             <w:r>
-              <w:t>★★★ Alta (3 estrellas)</w:t>
+              <w:t>★★★ (Alta)</w:t>
             </w:r>
           </w:p>
         </w:tc>
         <w:tc>
           <w:tcPr>
-            <w:tcW w:type="dxa" w:w="5040"/>
+            <w:tcW w:type="dxa" w:w="2880"/>
           </w:tcPr>
           <w:p>
             <w:r>
@@ -458,7 +784,7 @@
       <w:tr>
         <w:tc>
           <w:tcPr>
-            <w:tcW w:type="dxa" w:w="1872"/>
+            <w:tcW w:type="dxa" w:w="2880"/>
           </w:tcPr>
           <w:p>
             <w:r>
@@ -468,21 +794,21 @@
         </w:tc>
         <w:tc>
           <w:tcPr>
-            <w:tcW w:type="dxa" w:w="2448"/>
+            <w:tcW w:type="dxa" w:w="2880"/>
           </w:tcPr>
           <w:p>
             <w:r>
-              <w:t>★★☆ Media (2 estrellas)</w:t>
+              <w:t>★★☆ (Media)</w:t>
             </w:r>
           </w:p>
         </w:tc>
         <w:tc>
           <w:tcPr>
-            <w:tcW w:type="dxa" w:w="5040"/>
+            <w:tcW w:type="dxa" w:w="2880"/>
           </w:tcPr>
           <w:p>
             <w:r>
-              <w:t>Setup sólido con algún factor de contexto moderado. Operar con posición más pequeña.</w:t>
+              <w:t>Setup sólido con algún factor de contexto moderado. Posición más pequeña.</w:t>
             </w:r>
           </w:p>
         </w:tc>
@@ -490,7 +816,7 @@
       <w:tr>
         <w:tc>
           <w:tcPr>
-            <w:tcW w:type="dxa" w:w="1872"/>
+            <w:tcW w:type="dxa" w:w="2880"/>
           </w:tcPr>
           <w:p>
             <w:r>
@@ -500,17 +826,17 @@
         </w:tc>
         <w:tc>
           <w:tcPr>
-            <w:tcW w:type="dxa" w:w="2448"/>
+            <w:tcW w:type="dxa" w:w="2880"/>
           </w:tcPr>
           <w:p>
             <w:r>
-              <w:t>★☆☆ Baja (1 estrella)</w:t>
+              <w:t>★☆☆ (Baja)</w:t>
             </w:r>
           </w:p>
         </w:tc>
         <w:tc>
           <w:tcPr>
-            <w:tcW w:type="dxa" w:w="5040"/>
+            <w:tcW w:type="dxa" w:w="2880"/>
           </w:tcPr>
           <w:p>
             <w:r>
@@ -522,7 +848,7 @@
       <w:tr>
         <w:tc>
           <w:tcPr>
-            <w:tcW w:type="dxa" w:w="1872"/>
+            <w:tcW w:type="dxa" w:w="2880"/>
           </w:tcPr>
           <w:p>
             <w:r>
@@ -532,7 +858,7 @@
         </w:tc>
         <w:tc>
           <w:tcPr>
-            <w:tcW w:type="dxa" w:w="2448"/>
+            <w:tcW w:type="dxa" w:w="2880"/>
           </w:tcPr>
           <w:p>
             <w:r>
@@ -542,11 +868,11 @@
         </w:tc>
         <w:tc>
           <w:tcPr>
-            <w:tcW w:type="dxa" w:w="5040"/>
+            <w:tcW w:type="dxa" w:w="2880"/>
           </w:tcPr>
           <w:p>
             <w:r>
-              <w:t>Condiciones técnicas buenas pero hay un evento temporal (earnings ≤7 días, RSI ≥72 con score alto, contexto desfavorable). Mover a En Seguimiento y re-analizar tras el evento.</w:t>
+              <w:t>Condiciones técnicas buenas pero hay evento temporal (earnings ≤7d, RSI ≥72, contexto desfavorable).</w:t>
             </w:r>
           </w:p>
         </w:tc>
@@ -554,7 +880,7 @@
       <w:tr>
         <w:tc>
           <w:tcPr>
-            <w:tcW w:type="dxa" w:w="1872"/>
+            <w:tcW w:type="dxa" w:w="2880"/>
           </w:tcPr>
           <w:p>
             <w:r>
@@ -564,7 +890,7 @@
         </w:tc>
         <w:tc>
           <w:tcPr>
-            <w:tcW w:type="dxa" w:w="2448"/>
+            <w:tcW w:type="dxa" w:w="2880"/>
           </w:tcPr>
           <w:p>
             <w:r>
@@ -574,11 +900,11 @@
         </w:tc>
         <w:tc>
           <w:tcPr>
-            <w:tcW w:type="dxa" w:w="5040"/>
+            <w:tcW w:type="dxa" w:w="2880"/>
           </w:tcPr>
           <w:p>
             <w:r>
-              <w:t>Sin señal clara. Score entre 30-44. No hay niveles operacionales.</w:t>
+              <w:t>Score 30–44. Sin señal clara.</w:t>
             </w:r>
           </w:p>
         </w:tc>
@@ -586,7 +912,7 @@
       <w:tr>
         <w:tc>
           <w:tcPr>
-            <w:tcW w:type="dxa" w:w="1872"/>
+            <w:tcW w:type="dxa" w:w="2880"/>
           </w:tcPr>
           <w:p>
             <w:r>
@@ -596,7 +922,7 @@
         </w:tc>
         <w:tc>
           <w:tcPr>
-            <w:tcW w:type="dxa" w:w="2448"/>
+            <w:tcW w:type="dxa" w:w="2880"/>
           </w:tcPr>
           <w:p>
             <w:r>
@@ -606,156 +932,267 @@
         </w:tc>
         <w:tc>
           <w:tcPr>
-            <w:tcW w:type="dxa" w:w="5040"/>
+            <w:tcW w:type="dxa" w:w="2880"/>
           </w:tcPr>
           <w:p>
             <w:r>
-              <w:t>Condiciones muy desfavorables (score &lt;30). No operar.</w:t>
+              <w:t>Score &lt;30. No operar.</w:t>
             </w:r>
           </w:p>
         </w:tc>
       </w:tr>
     </w:tbl>
     <w:p>
-      <w:pPr/>
+      <w:pPr>
+        <w:pStyle w:val="Heading2"/>
+      </w:pPr>
       <w:r>
-        <w:t>Precio: Se muestra con 15 minutos de delay durante horario de mercado (badge verde). Fuera de horario muestra el precio de cierre anterior (badge amarillo). Precio proporcionado por Alpha Vantage GLOBAL_QUOTE con suscripción premium.</w:t>
+        <w:t>Badge entryZone — Método A / Método B</w:t>
+      </w:r>
+    </w:p>
+    <w:tbl>
+      <w:tblPr>
+        <w:tblStyle w:val="TableGrid"/>
+        <w:tblW w:type="auto" w:w="0"/>
+        <w:tblLook w:firstColumn="1" w:firstRow="1" w:lastColumn="0" w:lastRow="0" w:noHBand="0" w:noVBand="1" w:val="04A0"/>
+      </w:tblPr>
+      <w:tblGrid>
+        <w:gridCol w:w="2880"/>
+        <w:gridCol w:w="2880"/>
+        <w:gridCol w:w="2880"/>
+      </w:tblGrid>
+      <w:tr>
+        <w:tc>
+          <w:tcPr>
+            <w:tcW w:type="dxa" w:w="2880"/>
+          </w:tcPr>
+          <w:p>
+            <w:r>
+              <w:rPr>
+                <w:b/>
+              </w:rPr>
+              <w:t>Badge</w:t>
+            </w:r>
+          </w:p>
+        </w:tc>
+        <w:tc>
+          <w:tcPr>
+            <w:tcW w:type="dxa" w:w="2880"/>
+          </w:tcPr>
+          <w:p>
+            <w:r>
+              <w:rPr>
+                <w:b/>
+              </w:rPr>
+              <w:t>Estado</w:t>
+            </w:r>
+          </w:p>
+        </w:tc>
+        <w:tc>
+          <w:tcPr>
+            <w:tcW w:type="dxa" w:w="2880"/>
+          </w:tcPr>
+          <w:p>
+            <w:r>
+              <w:rPr>
+                <w:b/>
+              </w:rPr>
+              <w:t>Acción</w:t>
+            </w:r>
+          </w:p>
+        </w:tc>
+      </w:tr>
+      <w:tr>
+        <w:tc>
+          <w:tcPr>
+            <w:tcW w:type="dxa" w:w="2880"/>
+          </w:tcPr>
+          <w:p/>
+        </w:tc>
+        <w:tc>
+          <w:tcPr>
+            <w:tcW w:type="dxa" w:w="2880"/>
+          </w:tcPr>
+          <w:p/>
+        </w:tc>
+        <w:tc>
+          <w:tcPr>
+            <w:tcW w:type="dxa" w:w="2880"/>
+          </w:tcPr>
+          <w:p/>
+        </w:tc>
+      </w:tr>
+      <w:tr>
+        <w:tc>
+          <w:tcPr>
+            <w:tcW w:type="dxa" w:w="2880"/>
+          </w:tcPr>
+          <w:p/>
+        </w:tc>
+        <w:tc>
+          <w:tcPr>
+            <w:tcW w:type="dxa" w:w="2880"/>
+          </w:tcPr>
+          <w:p/>
+        </w:tc>
+        <w:tc>
+          <w:tcPr>
+            <w:tcW w:type="dxa" w:w="2880"/>
+          </w:tcPr>
+          <w:p/>
+        </w:tc>
+      </w:tr>
+      <w:tr>
+        <w:tc>
+          <w:tcPr>
+            <w:tcW w:type="dxa" w:w="2880"/>
+          </w:tcPr>
+          <w:p/>
+        </w:tc>
+        <w:tc>
+          <w:tcPr>
+            <w:tcW w:type="dxa" w:w="2880"/>
+          </w:tcPr>
+          <w:p/>
+        </w:tc>
+        <w:tc>
+          <w:tcPr>
+            <w:tcW w:type="dxa" w:w="2880"/>
+          </w:tcPr>
+          <w:p/>
+        </w:tc>
+      </w:tr>
+      <w:tr>
+        <w:tc>
+          <w:tcPr>
+            <w:tcW w:type="dxa" w:w="2880"/>
+          </w:tcPr>
+          <w:p>
+            <w:r>
+              <w:t>VERDE — Precio en zona de entrada</w:t>
+            </w:r>
+          </w:p>
+        </w:tc>
+        <w:tc>
+          <w:tcPr>
+            <w:tcW w:type="dxa" w:w="2880"/>
+          </w:tcPr>
+          <w:p>
+            <w:r>
+              <w:t>in_zone</w:t>
+            </w:r>
+          </w:p>
+        </w:tc>
+        <w:tc>
+          <w:tcPr>
+            <w:tcW w:type="dxa" w:w="2880"/>
+          </w:tcPr>
+          <w:p>
+            <w:r>
+              <w:t>Método A: entrar con orden de mercado dentro del rango entryLow–entryHigh.</w:t>
+            </w:r>
+          </w:p>
+        </w:tc>
+      </w:tr>
+      <w:tr>
+        <w:tc>
+          <w:tcPr>
+            <w:tcW w:type="dxa" w:w="2880"/>
+          </w:tcPr>
+          <w:p>
+            <w:r>
+              <w:t>ÁMBAR — Espera pullback</w:t>
+            </w:r>
+          </w:p>
+        </w:tc>
+        <w:tc>
+          <w:tcPr>
+            <w:tcW w:type="dxa" w:w="2880"/>
+          </w:tcPr>
+          <w:p>
+            <w:r>
+              <w:t>wait_pullback</w:t>
+            </w:r>
+          </w:p>
+        </w:tc>
+        <w:tc>
+          <w:tcPr>
+            <w:tcW w:type="dxa" w:w="2880"/>
+          </w:tcPr>
+          <w:p>
+            <w:r>
+              <w:t>Método B: poner orden límite en entryLow–entryHigh y mover a En Seguimiento.</w:t>
+            </w:r>
+          </w:p>
+        </w:tc>
+      </w:tr>
+      <w:tr>
+        <w:tc>
+          <w:tcPr>
+            <w:tcW w:type="dxa" w:w="2880"/>
+          </w:tcPr>
+          <w:p>
+            <w:r>
+              <w:t>ROJO — Precio fuera de zona</w:t>
+            </w:r>
+          </w:p>
+        </w:tc>
+        <w:tc>
+          <w:tcPr>
+            <w:tcW w:type="dxa" w:w="2880"/>
+          </w:tcPr>
+          <w:p>
+            <w:r>
+              <w:t>below_zone</w:t>
+            </w:r>
+          </w:p>
+        </w:tc>
+        <w:tc>
+          <w:tcPr>
+            <w:tcW w:type="dxa" w:w="2880"/>
+          </w:tcPr>
+          <w:p>
+            <w:r>
+              <w:t>Setup invalidado — no entrar.</w:t>
+            </w:r>
+          </w:p>
+        </w:tc>
+      </w:tr>
+    </w:tbl>
+    <w:p>
+      <w:pPr>
+        <w:pStyle w:val="Heading2"/>
+      </w:pPr>
+      <w:r>
+        <w:t>Indicadores de historial en tarjeta</w:t>
       </w:r>
     </w:p>
     <w:p>
-      <w:pPr/>
       <w:r>
-        <w:t>Badge de entryZone — Método A / Método B:</w:t>
+        <w:t>Badge verde "TRADE ACTIVO · Entrada $XX.XX · +X.X%": aparece cuando hay una operación abierta en el journal para esa acción. Muestra el precio de entrada real y el P&amp;L en vivo vs precio actual.</w:t>
+        <w:br/>
+        <w:br/>
+        <w:t>Badge gris "Último trade cerrado · fecha · hace Xd": aparece cuando el último trade está cerrado. Útil para evitar re-entrar demasiado pronto.</w:t>
+        <w:br/>
+        <w:br/>
+        <w:t>Estos badges se excluyen mutuamente. El botón "Guardar en journal" queda deshabilitado con trade activo.</w:t>
       </w:r>
     </w:p>
     <w:p>
       <w:pPr>
-        <w:pStyle w:val="ListBullet"/>
+        <w:pStyle w:val="Heading2"/>
       </w:pPr>
       <w:r>
-        <w:t>Badge VERDE 'Precio en zona de entrada': el precio está cerca de SMA21. Método A — entrar con orden de mercado dentro del rango entryLow-entryHigh.</w:t>
+        <w:t>Banner Ex-Dividend (swing)</w:t>
       </w:r>
     </w:p>
     <w:p>
-      <w:pPr>
-        <w:pStyle w:val="ListBullet"/>
-      </w:pPr>
       <w:r>
-        <w:t>Badge ÁMBAR 'Espera pullback': el precio está por encima de la zona SMA21/SMA50. Método B — poner orden límite en el rango entryLow-entryHigh y mover la acción a En Seguimiento.</w:t>
-      </w:r>
-    </w:p>
-    <w:p>
-      <w:pPr>
-        <w:pStyle w:val="ListBullet"/>
-      </w:pPr>
-      <w:r>
-        <w:t>Badge ROJO 'Precio fuera de zona': el precio está por debajo de SMA21. Setup invalidado — no entrar.</w:t>
-      </w:r>
-    </w:p>
-    <w:p>
-      <w:pPr/>
-      <w:r>
-        <w:t>Indicadores de historial en la tarjeta:</w:t>
-      </w:r>
-    </w:p>
-    <w:p>
-      <w:pPr>
-        <w:pStyle w:val="ListBullet"/>
-      </w:pPr>
-      <w:r>
-        <w:t>Badge verde 'TRADE ACTIVO · Entrada $XX.XX · +X.X%': aparece cuando ya tienes una operación abierta en el journal para esa acción. Muestra el precio de entrada real y el P&amp;L en vivo calculado con el precio actual. El botón 'Guardar en journal' queda deshabilitado mientras haya un trade activo.</w:t>
-      </w:r>
-    </w:p>
-    <w:p>
-      <w:pPr>
-        <w:pStyle w:val="ListBullet"/>
-      </w:pPr>
-      <w:r>
-        <w:t>Badge gris 'Último trade cerrado · fecha · hace Xd': aparece cuando el último trade de esa acción está cerrado. Indica cuándo fue la última vez que operaste esa acción. Útil para evitar re-entrar demasiado pronto.</w:t>
-      </w:r>
-    </w:p>
-    <w:p>
-      <w:pPr>
-        <w:pStyle w:val="ListBullet"/>
-      </w:pPr>
-      <w:r>
-        <w:t>Estos badges se excluyen mutuamente: si hay trade activo, no se muestra el del último cerrado.</w:t>
-      </w:r>
-    </w:p>
-    <w:p>
-      <w:pPr/>
-      <w:r>
-        <w:t>Banner Ex-Dividend:</w:t>
-      </w:r>
-    </w:p>
-    <w:p>
-      <w:pPr>
-        <w:pStyle w:val="ListBullet"/>
-      </w:pPr>
-      <w:r>
-        <w:t>Si la acción tiene fecha ex-dividend dentro del plazo máximo del trade (10-30 días según ATR), aparece un banner destacado debajo del precio.</w:t>
-      </w:r>
-    </w:p>
-    <w:p>
-      <w:pPr>
-        <w:pStyle w:val="ListBullet"/>
-      </w:pPr>
-      <w:r>
-        <w:t>Banner ROJO (≤5 días): '⚠ EX-DIVIDEND en X días — fecha · $X/acc'. Texto: 'El precio caerá ~el monto del dividendo. Evitar abrir posición ahora.'</w:t>
-      </w:r>
-    </w:p>
-    <w:p>
-      <w:pPr>
-        <w:pStyle w:val="ListBullet"/>
-      </w:pPr>
-      <w:r>
-        <w:t>Banner ÁMBAR (6 días hasta el plazo máximo): advertencia moderada sobre presión vendedora post-pago.</w:t>
-      </w:r>
-    </w:p>
-    <w:p>
-      <w:pPr>
-        <w:pStyle w:val="ListBullet"/>
-      </w:pPr>
-      <w:r>
-        <w:t>Sin banner si el ex-dividend cae después del plazo del trade — no es relevante para la operación.</w:t>
-      </w:r>
-    </w:p>
-    <w:p>
-      <w:pPr>
-        <w:pStyle w:val="ListBullet"/>
-      </w:pPr>
-      <w:r>
-        <w:t>Los datos (fecha, monto por acción, yield) vienen de Alpha Vantage OVERVIEW, sin llamadas adicionales a la API.</w:t>
-      </w:r>
-    </w:p>
-    <w:p>
-      <w:pPr/>
-      <w:r>
-        <w:t>Botón 'En Seguimiento':</w:t>
-      </w:r>
-    </w:p>
-    <w:p>
-      <w:pPr>
-        <w:pStyle w:val="ListBullet"/>
-      </w:pPr>
-      <w:r>
-        <w:t>Aparece al pie de todas las tarjetas con datos válidos, junto al botón de Journal. Permite mover al tab 'En Seguimiento' cualquier acción con setup válido.</w:t>
-      </w:r>
-    </w:p>
-    <w:p>
-      <w:pPr>
-        <w:pStyle w:val="ListBullet"/>
-      </w:pPr>
-      <w:r>
-        <w:t>Caso de uso principal: acciones con señal COMPRAR y badge ámbar wait_pullback (Método B).</w:t>
-      </w:r>
-    </w:p>
-    <w:p>
-      <w:pPr>
-        <w:pStyle w:val="ListBullet"/>
-      </w:pPr>
-      <w:r>
-        <w:t>En el tab 'En Seguimiento': el botón cambia a '← Quitar del seguimiento'.</w:t>
+        <w:t>Aparece solo si la fecha ex-dividend cae dentro del plazo máximo del trade (max_days).</w:t>
+        <w:br/>
+        <w:t>Banner ROJO (≤5 días): evitar abrir posición. Banner ÁMBAR (6d hasta el plazo): advertencia moderada.</w:t>
+        <w:br/>
+        <w:t>Sin banner si el ex-dividend es posterior al plazo del trade — no es relevante.</w:t>
       </w:r>
     </w:p>
     <w:p>
@@ -767,42 +1204,13 @@
       </w:r>
     </w:p>
     <w:p>
-      <w:pPr>
-        <w:pStyle w:val="ListBullet"/>
-      </w:pPr>
       <w:r>
-        <w:t>Acciones con buenas condiciones técnicas que están esperando el momento de entrada — ya sea porque se está esperando un pullback (Método B) o un evento puntual (earnings, RSI alto).</w:t>
-      </w:r>
-    </w:p>
-    <w:p>
-      <w:pPr>
-        <w:pStyle w:val="ListBullet"/>
-      </w:pPr>
-      <w:r>
-        <w:t>El usuario decide explícitamente mover una acción aquí usando el botón 'En Seguimiento'.</w:t>
-      </w:r>
-    </w:p>
-    <w:p>
-      <w:pPr>
-        <w:pStyle w:val="ListBullet"/>
-      </w:pPr>
-      <w:r>
-        <w:t>Aparece cuando: (a) señal MONITOREAR (earnings ≤7 días, RSI ≥72 con score alto, contexto desfavorable), o (b) señal COMPRAR con entryZone=wait_pullback.</w:t>
-      </w:r>
-    </w:p>
-    <w:p>
-      <w:pPr>
-        <w:pStyle w:val="ListBullet"/>
-      </w:pPr>
-      <w:r>
-        <w:t>Re-analizar la acción después del evento o cuando el precio regrese a la zona para ver si la señal mejora.</w:t>
-      </w:r>
-    </w:p>
-    <w:p>
-      <w:pPr>
-        <w:pStyle w:val="ListBullet"/>
-      </w:pPr>
-      <w:r>
+        <w:t>Acciones con buenas condiciones técnicas esperando el momento de entrada. El usuario decide explícitamente mover una acción aquí usando el botón "En Seguimiento".</w:t>
+        <w:br/>
+        <w:br/>
+        <w:t>Casos de uso: (a) señal MONITOREAR (earnings, RSI alto, contexto desfavorable), o (b) señal COMPRAR con entryZone = wait_pullback (Método B).</w:t>
+        <w:br/>
+        <w:br/>
         <w:t>El contador en la pestaña refleja las acciones realmente visibles.</w:t>
       </w:r>
     </w:p>
@@ -811,31 +1219,32 @@
         <w:pStyle w:val="Heading2"/>
       </w:pPr>
       <w:r>
-        <w:t>4. Pestaña Journal</w:t>
+        <w:t>4. Pestaña Journal Swing</w:t>
+      </w:r>
+    </w:p>
+    <w:p>
+      <w:r>
+        <w:t>Filtros: Todas, Abiertas, Breakeven, Parciales, Cerradas. Búsqueda por ticker.</w:t>
+        <w:br/>
+        <w:br/>
+        <w:t>Sección "Análisis de la app" (referencia): valores teóricos al momento de guardar.</w:t>
+        <w:br/>
+        <w:t>Sección "Mi operación real" (editable): precio de entrada, N° acciones, SL real, TP real, precio cierre, estado, notas.</w:t>
+        <w:br/>
+        <w:br/>
+        <w:t>P&amp;L: (precio cierre − precio entrada) × N° acciones.</w:t>
+        <w:br/>
+        <w:t>Resumen de cerradas al filtrar por "Cerradas": total invertido, P&amp;L USD y P&amp;L % total.</w:t>
+        <w:br/>
+        <w:t>exit_date se asigna al cerrar por primera vez — no se sobrescribe al editar posteriormente.</w:t>
       </w:r>
     </w:p>
     <w:p>
       <w:pPr>
-        <w:pStyle w:val="ListBullet"/>
+        <w:pStyle w:val="Heading2"/>
       </w:pPr>
       <w:r>
-        <w:t>Por defecto muestra operaciones Abiertas. Filtra por: Todas, Abiertas, Breakeven, Parciales, Cerradas.</w:t>
-      </w:r>
-    </w:p>
-    <w:p>
-      <w:pPr>
-        <w:pStyle w:val="ListBullet"/>
-      </w:pPr>
-      <w:r>
-        <w:t>Sección 'Análisis de la app' (solo referencia): valores teóricos calculados al momento de guardar (precio sugerido, rango de entrada, SL app, objetivo app, R:B, RSI, SMA21, SMA200).</w:t>
-      </w:r>
-    </w:p>
-    <w:p>
-      <w:pPr>
-        <w:pStyle w:val="ListBullet"/>
-      </w:pPr>
-      <w:r>
-        <w:t>Sección 'Mi operación real' (editable):</w:t>
+        <w:t>5. Estrategia Set and Forget — parámetros</w:t>
       </w:r>
     </w:p>
     <w:tbl>
@@ -845,28 +1254,40 @@
         <w:tblLook w:firstColumn="1" w:firstRow="1" w:lastColumn="0" w:lastRow="0" w:noHBand="0" w:noVBand="1" w:val="04A0"/>
       </w:tblPr>
       <w:tblGrid>
-        <w:gridCol w:w="4320"/>
-        <w:gridCol w:w="4320"/>
+        <w:gridCol w:w="2880"/>
+        <w:gridCol w:w="2880"/>
+        <w:gridCol w:w="2880"/>
       </w:tblGrid>
       <w:tr>
         <w:tc>
           <w:tcPr>
             <w:tcW w:type="dxa" w:w="2880"/>
-            <w:shd w:val="clear" w:color="auto" w:fill="DAEEF3"/>
           </w:tcPr>
           <w:p>
             <w:r>
               <w:rPr>
                 <w:b/>
               </w:rPr>
-              <w:t>Campo</w:t>
+              <w:t>Parámetro</w:t>
             </w:r>
           </w:p>
         </w:tc>
         <w:tc>
           <w:tcPr>
-            <w:tcW w:type="dxa" w:w="6480"/>
-            <w:shd w:val="clear" w:color="auto" w:fill="DAEEF3"/>
+            <w:tcW w:type="dxa" w:w="2880"/>
+          </w:tcPr>
+          <w:p>
+            <w:r>
+              <w:rPr>
+                <w:b/>
+              </w:rPr>
+              <w:t>Valor</w:t>
+            </w:r>
+          </w:p>
+        </w:tc>
+        <w:tc>
+          <w:tcPr>
+            <w:tcW w:type="dxa" w:w="2880"/>
           </w:tcPr>
           <w:p>
             <w:r>
@@ -883,19 +1304,129 @@
           <w:tcPr>
             <w:tcW w:type="dxa" w:w="2880"/>
           </w:tcPr>
+          <w:p/>
+        </w:tc>
+        <w:tc>
+          <w:tcPr>
+            <w:tcW w:type="dxa" w:w="2880"/>
+          </w:tcPr>
+          <w:p/>
+        </w:tc>
+        <w:tc>
+          <w:tcPr>
+            <w:tcW w:type="dxa" w:w="2880"/>
+          </w:tcPr>
+          <w:p/>
+        </w:tc>
+      </w:tr>
+      <w:tr>
+        <w:tc>
+          <w:tcPr>
+            <w:tcW w:type="dxa" w:w="2880"/>
+          </w:tcPr>
+          <w:p/>
+        </w:tc>
+        <w:tc>
+          <w:tcPr>
+            <w:tcW w:type="dxa" w:w="2880"/>
+          </w:tcPr>
+          <w:p/>
+        </w:tc>
+        <w:tc>
+          <w:tcPr>
+            <w:tcW w:type="dxa" w:w="2880"/>
+          </w:tcPr>
+          <w:p/>
+        </w:tc>
+      </w:tr>
+      <w:tr>
+        <w:tc>
+          <w:tcPr>
+            <w:tcW w:type="dxa" w:w="2880"/>
+          </w:tcPr>
+          <w:p/>
+        </w:tc>
+        <w:tc>
+          <w:tcPr>
+            <w:tcW w:type="dxa" w:w="2880"/>
+          </w:tcPr>
+          <w:p/>
+        </w:tc>
+        <w:tc>
+          <w:tcPr>
+            <w:tcW w:type="dxa" w:w="2880"/>
+          </w:tcPr>
+          <w:p/>
+        </w:tc>
+      </w:tr>
+      <w:tr>
+        <w:tc>
+          <w:tcPr>
+            <w:tcW w:type="dxa" w:w="2880"/>
+          </w:tcPr>
+          <w:p/>
+        </w:tc>
+        <w:tc>
+          <w:tcPr>
+            <w:tcW w:type="dxa" w:w="2880"/>
+          </w:tcPr>
+          <w:p/>
+        </w:tc>
+        <w:tc>
+          <w:tcPr>
+            <w:tcW w:type="dxa" w:w="2880"/>
+          </w:tcPr>
+          <w:p/>
+        </w:tc>
+      </w:tr>
+      <w:tr>
+        <w:tc>
+          <w:tcPr>
+            <w:tcW w:type="dxa" w:w="2880"/>
+          </w:tcPr>
+          <w:p/>
+        </w:tc>
+        <w:tc>
+          <w:tcPr>
+            <w:tcW w:type="dxa" w:w="2880"/>
+          </w:tcPr>
+          <w:p/>
+        </w:tc>
+        <w:tc>
+          <w:tcPr>
+            <w:tcW w:type="dxa" w:w="2880"/>
+          </w:tcPr>
+          <w:p/>
+        </w:tc>
+      </w:tr>
+      <w:tr>
+        <w:tc>
+          <w:tcPr>
+            <w:tcW w:type="dxa" w:w="2880"/>
+          </w:tcPr>
           <w:p>
             <w:r>
-              <w:t>Precio entrada real</w:t>
+              <w:t>Zona BUY</w:t>
             </w:r>
           </w:p>
         </w:tc>
         <w:tc>
           <w:tcPr>
-            <w:tcW w:type="dxa" w:w="6480"/>
+            <w:tcW w:type="dxa" w:w="2880"/>
           </w:tcPr>
           <w:p>
             <w:r>
-              <w:t>Precio al que realmente compraste.</w:t>
+              <w:t>entryLow–entryHigh</w:t>
+            </w:r>
+          </w:p>
+        </w:tc>
+        <w:tc>
+          <w:tcPr>
+            <w:tcW w:type="dxa" w:w="2880"/>
+          </w:tcPr>
+          <w:p>
+            <w:r>
+              <w:t>SMA21 × 0.995 a SMA21 × 1.010</w:t>
             </w:r>
           </w:p>
         </w:tc>
@@ -907,17 +1438,27 @@
           </w:tcPr>
           <w:p>
             <w:r>
-              <w:t>N° acciones</w:t>
+              <w:t>Stop-loss</w:t>
             </w:r>
           </w:p>
         </w:tc>
         <w:tc>
           <w:tcPr>
-            <w:tcW w:type="dxa" w:w="6480"/>
+            <w:tcW w:type="dxa" w:w="2880"/>
           </w:tcPr>
           <w:p>
             <w:r>
-              <w:t>Cantidad de acciones compradas.</w:t>
+              <w:t>Mínimo 20 días × 0.995</w:t>
+            </w:r>
+          </w:p>
+        </w:tc>
+        <w:tc>
+          <w:tcPr>
+            <w:tcW w:type="dxa" w:w="2880"/>
+          </w:tcPr>
+          <w:p>
+            <w:r>
+              <w:t>Anclado al soporte real. No se mueve.</w:t>
             </w:r>
           </w:p>
         </w:tc>
@@ -929,17 +1470,27 @@
           </w:tcPr>
           <w:p>
             <w:r>
-              <w:t>Stop-loss real (broker)</w:t>
+              <w:t>Objetivo</w:t>
             </w:r>
           </w:p>
         </w:tc>
         <w:tc>
           <w:tcPr>
-            <w:tcW w:type="dxa" w:w="6480"/>
+            <w:tcW w:type="dxa" w:w="2880"/>
           </w:tcPr>
           <w:p>
             <w:r>
-              <w:t>SL que configuraste en el broker.</w:t>
+              <w:t>R:B mínimo 2.5x</w:t>
+            </w:r>
+          </w:p>
+        </w:tc>
+        <w:tc>
+          <w:tcPr>
+            <w:tcW w:type="dxa" w:w="2880"/>
+          </w:tcPr>
+          <w:p>
+            <w:r>
+              <w:t>target = max(máx 20d, entry_mid + riesgo × 2.5)</w:t>
             </w:r>
           </w:p>
         </w:tc>
@@ -951,17 +1502,27 @@
           </w:tcPr>
           <w:p>
             <w:r>
-              <w:t>Take profit real (broker)</w:t>
+              <w:t>Plazo</w:t>
             </w:r>
           </w:p>
         </w:tc>
         <w:tc>
           <w:tcPr>
-            <w:tcW w:type="dxa" w:w="6480"/>
+            <w:tcW w:type="dxa" w:w="2880"/>
           </w:tcPr>
           <w:p>
             <w:r>
-              <w:t>TP que configuraste en el broker.</w:t>
+              <w:t>10–30 días (ATR)</w:t>
+            </w:r>
+          </w:p>
+        </w:tc>
+        <w:tc>
+          <w:tcPr>
+            <w:tcW w:type="dxa" w:w="2880"/>
+          </w:tcPr>
+          <w:p>
+            <w:r>
+              <w:t>Calculado con volatilidad real de la acción.</w:t>
             </w:r>
           </w:p>
         </w:tc>
@@ -973,295 +1534,13 @@
           </w:tcPr>
           <w:p>
             <w:r>
-              <w:t>Precio cierre real</w:t>
-            </w:r>
-          </w:p>
-        </w:tc>
-        <w:tc>
-          <w:tcPr>
-            <w:tcW w:type="dxa" w:w="6480"/>
-          </w:tcPr>
-          <w:p>
-            <w:r>
-              <w:t>Precio al que se cerró la posición.</w:t>
-            </w:r>
-          </w:p>
-        </w:tc>
-      </w:tr>
-      <w:tr>
-        <w:tc>
-          <w:tcPr>
-            <w:tcW w:type="dxa" w:w="2880"/>
-          </w:tcPr>
-          <w:p>
-            <w:r>
-              <w:t>Estado</w:t>
-            </w:r>
-          </w:p>
-        </w:tc>
-        <w:tc>
-          <w:tcPr>
-            <w:tcW w:type="dxa" w:w="6480"/>
-          </w:tcPr>
-          <w:p>
-            <w:r>
-              <w:t>Abierta / Breakeven movido / Parcial cerrada / Cerrada.</w:t>
-            </w:r>
-          </w:p>
-        </w:tc>
-      </w:tr>
-      <w:tr>
-        <w:tc>
-          <w:tcPr>
-            <w:tcW w:type="dxa" w:w="2880"/>
-          </w:tcPr>
-          <w:p>
-            <w:r>
-              <w:t>P&amp;L</w:t>
-            </w:r>
-          </w:p>
-        </w:tc>
-        <w:tc>
-          <w:tcPr>
-            <w:tcW w:type="dxa" w:w="6480"/>
-          </w:tcPr>
-          <w:p>
-            <w:r>
-              <w:t>En % y USD. Fórmula: (precio cierre − precio entrada) × N° acciones = P&amp;L USD.</w:t>
-            </w:r>
-          </w:p>
-        </w:tc>
-      </w:tr>
-    </w:tbl>
-    <w:p>
-      <w:pPr>
-        <w:pStyle w:val="ListBullet"/>
-      </w:pPr>
-      <w:r>
-        <w:t>En la lista de operaciones el P&amp;L también aparece directamente en cada tarjeta.</w:t>
-      </w:r>
-    </w:p>
-    <w:p>
-      <w:pPr>
-        <w:pStyle w:val="ListBullet"/>
-      </w:pPr>
-      <w:r>
-        <w:t>Resumen de cerradas: al filtrar por 'Cerradas' aparece un bloque con total invertido, P&amp;L USD total y P&amp;L % sobre todas las operaciones cerradas con datos completos.</w:t>
-      </w:r>
-    </w:p>
-    <w:p>
-      <w:pPr>
-        <w:pStyle w:val="ListBullet"/>
-      </w:pPr>
-      <w:r>
-        <w:t>El botón ✕ muestra un modal de confirmación antes de eliminar. La eliminación es permanente.</w:t>
-      </w:r>
-    </w:p>
-    <w:p>
-      <w:pPr>
-        <w:pStyle w:val="Heading2"/>
-      </w:pPr>
-      <w:r>
-        <w:t>5. Estrategia Set and Forget — Objetivo único</w:t>
-      </w:r>
-    </w:p>
-    <w:tbl>
-      <w:tblPr>
-        <w:tblStyle w:val="TableGrid"/>
-        <w:tblW w:type="auto" w:w="0"/>
-        <w:tblLook w:firstColumn="1" w:firstRow="1" w:lastColumn="0" w:lastRow="0" w:noHBand="0" w:noVBand="1" w:val="04A0"/>
-      </w:tblPr>
-      <w:tblGrid>
-        <w:gridCol w:w="2880"/>
-        <w:gridCol w:w="2880"/>
-        <w:gridCol w:w="2880"/>
-      </w:tblGrid>
-      <w:tr>
-        <w:tc>
-          <w:tcPr>
-            <w:tcW w:type="dxa" w:w="2160"/>
-            <w:shd w:val="clear" w:color="auto" w:fill="DAEEF3"/>
-          </w:tcPr>
-          <w:p>
-            <w:r>
-              <w:rPr>
-                <w:b/>
-              </w:rPr>
-              <w:t>Parámetro</w:t>
-            </w:r>
-          </w:p>
-        </w:tc>
-        <w:tc>
-          <w:tcPr>
-            <w:tcW w:type="dxa" w:w="2448"/>
-            <w:shd w:val="clear" w:color="auto" w:fill="DAEEF3"/>
-          </w:tcPr>
-          <w:p>
-            <w:r>
-              <w:rPr>
-                <w:b/>
-              </w:rPr>
-              <w:t>Valor</w:t>
-            </w:r>
-          </w:p>
-        </w:tc>
-        <w:tc>
-          <w:tcPr>
-            <w:tcW w:type="dxa" w:w="4752"/>
-            <w:shd w:val="clear" w:color="auto" w:fill="DAEEF3"/>
-          </w:tcPr>
-          <w:p>
-            <w:r>
-              <w:rPr>
-                <w:b/>
-              </w:rPr>
-              <w:t>Descripción</w:t>
-            </w:r>
-          </w:p>
-        </w:tc>
-      </w:tr>
-      <w:tr>
-        <w:tc>
-          <w:tcPr>
-            <w:tcW w:type="dxa" w:w="2160"/>
-          </w:tcPr>
-          <w:p>
-            <w:r>
-              <w:t>Rango BUY</w:t>
-            </w:r>
-          </w:p>
-        </w:tc>
-        <w:tc>
-          <w:tcPr>
-            <w:tcW w:type="dxa" w:w="2448"/>
-          </w:tcPr>
-          <w:p>
-            <w:r>
-              <w:t>entryLow–entryHigh</w:t>
-            </w:r>
-          </w:p>
-        </w:tc>
-        <w:tc>
-          <w:tcPr>
-            <w:tcW w:type="dxa" w:w="4752"/>
-          </w:tcPr>
-          <w:p>
-            <w:r>
-              <w:t>Zona óptima anclada a SMA21: entryLow = SMA21 × 0.995, entryHigh = SMA21 × 1.010.</w:t>
-            </w:r>
-          </w:p>
-        </w:tc>
-      </w:tr>
-      <w:tr>
-        <w:tc>
-          <w:tcPr>
-            <w:tcW w:type="dxa" w:w="2160"/>
-          </w:tcPr>
-          <w:p>
-            <w:r>
-              <w:t>Stop-loss FIJO</w:t>
-            </w:r>
-          </w:p>
-        </w:tc>
-        <w:tc>
-          <w:tcPr>
-            <w:tcW w:type="dxa" w:w="2448"/>
-          </w:tcPr>
-          <w:p>
-            <w:r>
-              <w:t>Mínimo 20 días × 0.995</w:t>
-            </w:r>
-          </w:p>
-        </w:tc>
-        <w:tc>
-          <w:tcPr>
-            <w:tcW w:type="dxa" w:w="4752"/>
-          </w:tcPr>
-          <w:p>
-            <w:r>
-              <w:t>Anclado al mínimo histórico real de 20 días — el soporte real de la acción. No se mueve.</w:t>
-            </w:r>
-          </w:p>
-        </w:tc>
-      </w:tr>
-      <w:tr>
-        <w:tc>
-          <w:tcPr>
-            <w:tcW w:type="dxa" w:w="2160"/>
-          </w:tcPr>
-          <w:p>
-            <w:r>
-              <w:t>Objetivo único</w:t>
-            </w:r>
-          </w:p>
-        </w:tc>
-        <w:tc>
-          <w:tcPr>
-            <w:tcW w:type="dxa" w:w="2448"/>
-          </w:tcPr>
-          <w:p>
-            <w:r>
-              <w:t>R:B mínimo 2.5x</w:t>
-            </w:r>
-          </w:p>
-        </w:tc>
-        <w:tc>
-          <w:tcPr>
-            <w:tcW w:type="dxa" w:w="4752"/>
-          </w:tcPr>
-          <w:p>
-            <w:r>
-              <w:t>target = max(máximo 20 días, entry_mid + riesgo × 2.5). R:B garantizado.</w:t>
-            </w:r>
-          </w:p>
-        </w:tc>
-      </w:tr>
-      <w:tr>
-        <w:tc>
-          <w:tcPr>
-            <w:tcW w:type="dxa" w:w="2160"/>
-          </w:tcPr>
-          <w:p>
-            <w:r>
-              <w:t>Plazo dinámico</w:t>
-            </w:r>
-          </w:p>
-        </w:tc>
-        <w:tc>
-          <w:tcPr>
-            <w:tcW w:type="dxa" w:w="2448"/>
-          </w:tcPr>
-          <w:p>
-            <w:r>
-              <w:t>10–30 días (ATR)</w:t>
-            </w:r>
-          </w:p>
-        </w:tc>
-        <w:tc>
-          <w:tcPr>
-            <w:tcW w:type="dxa" w:w="4752"/>
-          </w:tcPr>
-          <w:p>
-            <w:r>
-              <w:t>Calculado con volatilidad real de la acción.</w:t>
-            </w:r>
-          </w:p>
-        </w:tc>
-      </w:tr>
-      <w:tr>
-        <w:tc>
-          <w:tcPr>
-            <w:tcW w:type="dxa" w:w="2160"/>
-          </w:tcPr>
-          <w:p>
-            <w:r>
               <w:t>Orden broker</w:t>
             </w:r>
           </w:p>
         </w:tc>
         <w:tc>
           <w:tcPr>
-            <w:tcW w:type="dxa" w:w="2448"/>
+            <w:tcW w:type="dxa" w:w="2880"/>
           </w:tcPr>
           <w:p>
             <w:r>
@@ -1271,7 +1550,7 @@
         </w:tc>
         <w:tc>
           <w:tcPr>
-            <w:tcW w:type="dxa" w:w="4752"/>
+            <w:tcW w:type="dxa" w:w="2880"/>
           </w:tcPr>
           <w:p>
             <w:r>
@@ -1289,12 +1568,6 @@
         <w:t>6. Barra de vigencia del setup</w:t>
       </w:r>
     </w:p>
-    <w:p>
-      <w:pPr/>
-      <w:r>
-        <w:t>El plazo es dinámico por acción (10–30 días según ATR). La barra muestra 'Día X de Y' para mayor claridad.</w:t>
-      </w:r>
-    </w:p>
     <w:tbl>
       <w:tblPr>
         <w:tblStyle w:val="TableGrid"/>
@@ -1309,8 +1582,7 @@
       <w:tr>
         <w:tc>
           <w:tcPr>
-            <w:tcW w:type="dxa" w:w="1728"/>
-            <w:shd w:val="clear" w:color="auto" w:fill="DAEEF3"/>
+            <w:tcW w:type="dxa" w:w="2880"/>
           </w:tcPr>
           <w:p>
             <w:r>
@@ -1324,7 +1596,6 @@
         <w:tc>
           <w:tcPr>
             <w:tcW w:type="dxa" w:w="2880"/>
-            <w:shd w:val="clear" w:color="auto" w:fill="DAEEF3"/>
           </w:tcPr>
           <w:p>
             <w:r>
@@ -1337,8 +1608,7 @@
         </w:tc>
         <w:tc>
           <w:tcPr>
-            <w:tcW w:type="dxa" w:w="4752"/>
-            <w:shd w:val="clear" w:color="auto" w:fill="DAEEF3"/>
+            <w:tcW w:type="dxa" w:w="2880"/>
           </w:tcPr>
           <w:p>
             <w:r>
@@ -1353,7 +1623,87 @@
       <w:tr>
         <w:tc>
           <w:tcPr>
-            <w:tcW w:type="dxa" w:w="1728"/>
+            <w:tcW w:type="dxa" w:w="2880"/>
+          </w:tcPr>
+          <w:p/>
+        </w:tc>
+        <w:tc>
+          <w:tcPr>
+            <w:tcW w:type="dxa" w:w="2880"/>
+          </w:tcPr>
+          <w:p/>
+        </w:tc>
+        <w:tc>
+          <w:tcPr>
+            <w:tcW w:type="dxa" w:w="2880"/>
+          </w:tcPr>
+          <w:p/>
+        </w:tc>
+      </w:tr>
+      <w:tr>
+        <w:tc>
+          <w:tcPr>
+            <w:tcW w:type="dxa" w:w="2880"/>
+          </w:tcPr>
+          <w:p/>
+        </w:tc>
+        <w:tc>
+          <w:tcPr>
+            <w:tcW w:type="dxa" w:w="2880"/>
+          </w:tcPr>
+          <w:p/>
+        </w:tc>
+        <w:tc>
+          <w:tcPr>
+            <w:tcW w:type="dxa" w:w="2880"/>
+          </w:tcPr>
+          <w:p/>
+        </w:tc>
+      </w:tr>
+      <w:tr>
+        <w:tc>
+          <w:tcPr>
+            <w:tcW w:type="dxa" w:w="2880"/>
+          </w:tcPr>
+          <w:p/>
+        </w:tc>
+        <w:tc>
+          <w:tcPr>
+            <w:tcW w:type="dxa" w:w="2880"/>
+          </w:tcPr>
+          <w:p/>
+        </w:tc>
+        <w:tc>
+          <w:tcPr>
+            <w:tcW w:type="dxa" w:w="2880"/>
+          </w:tcPr>
+          <w:p/>
+        </w:tc>
+      </w:tr>
+      <w:tr>
+        <w:tc>
+          <w:tcPr>
+            <w:tcW w:type="dxa" w:w="2880"/>
+          </w:tcPr>
+          <w:p/>
+        </w:tc>
+        <w:tc>
+          <w:tcPr>
+            <w:tcW w:type="dxa" w:w="2880"/>
+          </w:tcPr>
+          <w:p/>
+        </w:tc>
+        <w:tc>
+          <w:tcPr>
+            <w:tcW w:type="dxa" w:w="2880"/>
+          </w:tcPr>
+          <w:p/>
+        </w:tc>
+      </w:tr>
+      <w:tr>
+        <w:tc>
+          <w:tcPr>
+            <w:tcW w:type="dxa" w:w="2880"/>
           </w:tcPr>
           <w:p>
             <w:r>
@@ -1373,7 +1723,7 @@
         </w:tc>
         <w:tc>
           <w:tcPr>
-            <w:tcW w:type="dxa" w:w="4752"/>
+            <w:tcW w:type="dxa" w:w="2880"/>
           </w:tcPr>
           <w:p>
             <w:r>
@@ -1385,7 +1735,7 @@
       <w:tr>
         <w:tc>
           <w:tcPr>
-            <w:tcW w:type="dxa" w:w="1728"/>
+            <w:tcW w:type="dxa" w:w="2880"/>
           </w:tcPr>
           <w:p>
             <w:r>
@@ -1405,7 +1755,7 @@
         </w:tc>
         <w:tc>
           <w:tcPr>
-            <w:tcW w:type="dxa" w:w="4752"/>
+            <w:tcW w:type="dxa" w:w="2880"/>
           </w:tcPr>
           <w:p>
             <w:r>
@@ -1417,7 +1767,7 @@
       <w:tr>
         <w:tc>
           <w:tcPr>
-            <w:tcW w:type="dxa" w:w="1728"/>
+            <w:tcW w:type="dxa" w:w="2880"/>
           </w:tcPr>
           <w:p>
             <w:r>
@@ -1437,7 +1787,7 @@
         </w:tc>
         <w:tc>
           <w:tcPr>
-            <w:tcW w:type="dxa" w:w="4752"/>
+            <w:tcW w:type="dxa" w:w="2880"/>
           </w:tcPr>
           <w:p>
             <w:r>
@@ -1449,7 +1799,7 @@
       <w:tr>
         <w:tc>
           <w:tcPr>
-            <w:tcW w:type="dxa" w:w="1728"/>
+            <w:tcW w:type="dxa" w:w="2880"/>
           </w:tcPr>
           <w:p>
             <w:r>
@@ -1469,7 +1819,7 @@
         </w:tc>
         <w:tc>
           <w:tcPr>
-            <w:tcW w:type="dxa" w:w="4752"/>
+            <w:tcW w:type="dxa" w:w="2880"/>
           </w:tcPr>
           <w:p>
             <w:r>
@@ -1481,16 +1831,693 @@
     </w:tbl>
     <w:p>
       <w:pPr>
+        <w:pStyle w:val="Heading1"/>
+      </w:pPr>
+      <w:r>
+        <w:t>MÓDULO POSITION TRADING</w:t>
+      </w:r>
+    </w:p>
+    <w:p>
+      <w:pPr>
         <w:pStyle w:val="Heading2"/>
       </w:pPr>
       <w:r>
-        <w:t>7. Factor Ex-Dividend — Cuándo tenerlo en cuenta</w:t>
+        <w:t>1. Screener Position</w:t>
       </w:r>
     </w:p>
     <w:p>
-      <w:pPr/>
       <w:r>
-        <w:t>El precio de una acción cae aproximadamente el monto del dividendo en la fecha ex-dividend. Inversores que compran solo para capturar el dividendo suelen vender después del pago, generando presión bajista.</w:t>
+        <w:t>Se actualiza automáticamente los lunes a las 14:00 UTC (10:00 AM ET) via GitHub Actions.</w:t>
+        <w:br/>
+        <w:br/>
+        <w:t>Criterios Finviz: Precio &gt; SMA200, SMA50 &gt; SMA200 (golden cross), RSI 40–65, Vol &gt; 500k, Cap &gt; $300M, NYSE + NASDAQ.</w:t>
+        <w:br/>
+        <w:br/>
+        <w:t>Cada candidata aparece enriquecida con: empresa, sector, crecimiento de revenue/EPS, market cap, y badge "Base Nsem" (verde=sound ≥7 semanas, ámbar=short 3–6 semanas).</w:t>
+      </w:r>
+    </w:p>
+    <w:p>
+      <w:pPr>
+        <w:pStyle w:val="Heading2"/>
+      </w:pPr>
+      <w:r>
+        <w:t>2. Pestaña Watchlist Position — Cómo leer el scorecard</w:t>
+      </w:r>
+    </w:p>
+    <w:tbl>
+      <w:tblPr>
+        <w:tblStyle w:val="TableGrid"/>
+        <w:tblW w:type="auto" w:w="0"/>
+        <w:tblLook w:firstColumn="1" w:firstRow="1" w:lastColumn="0" w:lastRow="0" w:noHBand="0" w:noVBand="1" w:val="04A0"/>
+      </w:tblPr>
+      <w:tblGrid>
+        <w:gridCol w:w="2880"/>
+        <w:gridCol w:w="2880"/>
+        <w:gridCol w:w="2880"/>
+      </w:tblGrid>
+      <w:tr>
+        <w:tc>
+          <w:tcPr>
+            <w:tcW w:type="dxa" w:w="2880"/>
+          </w:tcPr>
+          <w:p>
+            <w:r>
+              <w:rPr>
+                <w:b/>
+              </w:rPr>
+              <w:t>Score / 51</w:t>
+            </w:r>
+          </w:p>
+        </w:tc>
+        <w:tc>
+          <w:tcPr>
+            <w:tcW w:type="dxa" w:w="2880"/>
+          </w:tcPr>
+          <w:p>
+            <w:r>
+              <w:rPr>
+                <w:b/>
+              </w:rPr>
+              <w:t>Decisión</w:t>
+            </w:r>
+          </w:p>
+        </w:tc>
+        <w:tc>
+          <w:tcPr>
+            <w:tcW w:type="dxa" w:w="2880"/>
+          </w:tcPr>
+          <w:p>
+            <w:r>
+              <w:rPr>
+                <w:b/>
+              </w:rPr>
+              <w:t>Acción</w:t>
+            </w:r>
+          </w:p>
+        </w:tc>
+      </w:tr>
+      <w:tr>
+        <w:tc>
+          <w:tcPr>
+            <w:tcW w:type="dxa" w:w="2880"/>
+          </w:tcPr>
+          <w:p/>
+        </w:tc>
+        <w:tc>
+          <w:tcPr>
+            <w:tcW w:type="dxa" w:w="2880"/>
+          </w:tcPr>
+          <w:p/>
+        </w:tc>
+        <w:tc>
+          <w:tcPr>
+            <w:tcW w:type="dxa" w:w="2880"/>
+          </w:tcPr>
+          <w:p/>
+        </w:tc>
+      </w:tr>
+      <w:tr>
+        <w:tc>
+          <w:tcPr>
+            <w:tcW w:type="dxa" w:w="2880"/>
+          </w:tcPr>
+          <w:p/>
+        </w:tc>
+        <w:tc>
+          <w:tcPr>
+            <w:tcW w:type="dxa" w:w="2880"/>
+          </w:tcPr>
+          <w:p/>
+        </w:tc>
+        <w:tc>
+          <w:tcPr>
+            <w:tcW w:type="dxa" w:w="2880"/>
+          </w:tcPr>
+          <w:p/>
+        </w:tc>
+      </w:tr>
+      <w:tr>
+        <w:tc>
+          <w:tcPr>
+            <w:tcW w:type="dxa" w:w="2880"/>
+          </w:tcPr>
+          <w:p/>
+        </w:tc>
+        <w:tc>
+          <w:tcPr>
+            <w:tcW w:type="dxa" w:w="2880"/>
+          </w:tcPr>
+          <w:p/>
+        </w:tc>
+        <w:tc>
+          <w:tcPr>
+            <w:tcW w:type="dxa" w:w="2880"/>
+          </w:tcPr>
+          <w:p/>
+        </w:tc>
+      </w:tr>
+      <w:tr>
+        <w:tc>
+          <w:tcPr>
+            <w:tcW w:type="dxa" w:w="2880"/>
+          </w:tcPr>
+          <w:p/>
+        </w:tc>
+        <w:tc>
+          <w:tcPr>
+            <w:tcW w:type="dxa" w:w="2880"/>
+          </w:tcPr>
+          <w:p/>
+        </w:tc>
+        <w:tc>
+          <w:tcPr>
+            <w:tcW w:type="dxa" w:w="2880"/>
+          </w:tcPr>
+          <w:p/>
+        </w:tc>
+      </w:tr>
+      <w:tr>
+        <w:tc>
+          <w:tcPr>
+            <w:tcW w:type="dxa" w:w="2880"/>
+          </w:tcPr>
+          <w:p>
+            <w:r>
+              <w:t>≥ 32</w:t>
+            </w:r>
+          </w:p>
+        </w:tc>
+        <w:tc>
+          <w:tcPr>
+            <w:tcW w:type="dxa" w:w="2880"/>
+          </w:tcPr>
+          <w:p>
+            <w:r>
+              <w:t>OPERAR CON CONVICCIÓN</w:t>
+            </w:r>
+          </w:p>
+        </w:tc>
+        <w:tc>
+          <w:tcPr>
+            <w:tcW w:type="dxa" w:w="2880"/>
+          </w:tcPr>
+          <w:p>
+            <w:r>
+              <w:t>Tamaño completo según sizing calculator.</w:t>
+            </w:r>
+          </w:p>
+        </w:tc>
+      </w:tr>
+      <w:tr>
+        <w:tc>
+          <w:tcPr>
+            <w:tcW w:type="dxa" w:w="2880"/>
+          </w:tcPr>
+          <w:p>
+            <w:r>
+              <w:t>22–31</w:t>
+            </w:r>
+          </w:p>
+        </w:tc>
+        <w:tc>
+          <w:tcPr>
+            <w:tcW w:type="dxa" w:w="2880"/>
+          </w:tcPr>
+          <w:p>
+            <w:r>
+              <w:t>OPERAR CON CAUTELA</w:t>
+            </w:r>
+          </w:p>
+        </w:tc>
+        <w:tc>
+          <w:tcPr>
+            <w:tcW w:type="dxa" w:w="2880"/>
+          </w:tcPr>
+          <w:p>
+            <w:r>
+              <w:t>Reducir posición 30–50%.</w:t>
+            </w:r>
+          </w:p>
+        </w:tc>
+      </w:tr>
+      <w:tr>
+        <w:tc>
+          <w:tcPr>
+            <w:tcW w:type="dxa" w:w="2880"/>
+          </w:tcPr>
+          <w:p>
+            <w:r>
+              <w:t>&lt; 22</w:t>
+            </w:r>
+          </w:p>
+        </w:tc>
+        <w:tc>
+          <w:tcPr>
+            <w:tcW w:type="dxa" w:w="2880"/>
+          </w:tcPr>
+          <w:p>
+            <w:r>
+              <w:t>NO OPERAR</w:t>
+            </w:r>
+          </w:p>
+        </w:tc>
+        <w:tc>
+          <w:tcPr>
+            <w:tcW w:type="dxa" w:w="2880"/>
+          </w:tcPr>
+          <w:p>
+            <w:r>
+              <w:t>No entrar aunque el gráfico se vea bien.</w:t>
+            </w:r>
+          </w:p>
+        </w:tc>
+      </w:tr>
+      <w:tr>
+        <w:tc>
+          <w:tcPr>
+            <w:tcW w:type="dxa" w:w="2880"/>
+          </w:tcPr>
+          <w:p>
+            <w:r>
+              <w:t>Veto activo</w:t>
+            </w:r>
+          </w:p>
+        </w:tc>
+        <w:tc>
+          <w:tcPr>
+            <w:tcW w:type="dxa" w:w="2880"/>
+          </w:tcPr>
+          <w:p>
+            <w:r>
+              <w:t>NO OPERAR (VETO)</w:t>
+            </w:r>
+          </w:p>
+        </w:tc>
+        <w:tc>
+          <w:tcPr>
+            <w:tcW w:type="dxa" w:w="2880"/>
+          </w:tcPr>
+          <w:p>
+            <w:r>
+              <w:t>Precio &lt; SMA200 o R/R &lt; 2. Independiente del score.</w:t>
+            </w:r>
+          </w:p>
+        </w:tc>
+      </w:tr>
+    </w:tbl>
+    <w:p>
+      <w:r>
+        <w:t>Ajuste macro: si SPY está bajo SMA200 (mercado bajista), el score se penaliza -4 puntos (regla Weinstein).</w:t>
+      </w:r>
+    </w:p>
+    <w:p>
+      <w:pPr>
+        <w:pStyle w:val="Heading2"/>
+      </w:pPr>
+      <w:r>
+        <w:t>Badges y warnings en tarjeta position</w:t>
+      </w:r>
+    </w:p>
+    <w:tbl>
+      <w:tblPr>
+        <w:tblStyle w:val="TableGrid"/>
+        <w:tblW w:type="auto" w:w="0"/>
+        <w:tblLook w:firstColumn="1" w:firstRow="1" w:lastColumn="0" w:lastRow="0" w:noHBand="0" w:noVBand="1" w:val="04A0"/>
+      </w:tblPr>
+      <w:tblGrid>
+        <w:gridCol w:w="4320"/>
+        <w:gridCol w:w="4320"/>
+      </w:tblGrid>
+      <w:tr>
+        <w:tc>
+          <w:tcPr>
+            <w:tcW w:type="dxa" w:w="4320"/>
+          </w:tcPr>
+          <w:p>
+            <w:r>
+              <w:rPr>
+                <w:b/>
+              </w:rPr>
+              <w:t>Badge / Warning</w:t>
+            </w:r>
+          </w:p>
+        </w:tc>
+        <w:tc>
+          <w:tcPr>
+            <w:tcW w:type="dxa" w:w="4320"/>
+          </w:tcPr>
+          <w:p>
+            <w:r>
+              <w:rPr>
+                <w:b/>
+              </w:rPr>
+              <w:t>Descripción</w:t>
+            </w:r>
+          </w:p>
+        </w:tc>
+      </w:tr>
+      <w:tr>
+        <w:tc>
+          <w:tcPr>
+            <w:tcW w:type="dxa" w:w="4320"/>
+          </w:tcPr>
+          <w:p/>
+        </w:tc>
+        <w:tc>
+          <w:tcPr>
+            <w:tcW w:type="dxa" w:w="4320"/>
+          </w:tcPr>
+          <w:p/>
+        </w:tc>
+      </w:tr>
+      <w:tr>
+        <w:tc>
+          <w:tcPr>
+            <w:tcW w:type="dxa" w:w="4320"/>
+          </w:tcPr>
+          <w:p/>
+        </w:tc>
+        <w:tc>
+          <w:tcPr>
+            <w:tcW w:type="dxa" w:w="4320"/>
+          </w:tcPr>
+          <w:p/>
+        </w:tc>
+      </w:tr>
+      <w:tr>
+        <w:tc>
+          <w:tcPr>
+            <w:tcW w:type="dxa" w:w="4320"/>
+          </w:tcPr>
+          <w:p/>
+        </w:tc>
+        <w:tc>
+          <w:tcPr>
+            <w:tcW w:type="dxa" w:w="4320"/>
+          </w:tcPr>
+          <w:p/>
+        </w:tc>
+      </w:tr>
+      <w:tr>
+        <w:tc>
+          <w:tcPr>
+            <w:tcW w:type="dxa" w:w="4320"/>
+          </w:tcPr>
+          <w:p/>
+        </w:tc>
+        <w:tc>
+          <w:tcPr>
+            <w:tcW w:type="dxa" w:w="4320"/>
+          </w:tcPr>
+          <w:p/>
+        </w:tc>
+      </w:tr>
+      <w:tr>
+        <w:tc>
+          <w:tcPr>
+            <w:tcW w:type="dxa" w:w="4320"/>
+          </w:tcPr>
+          <w:p/>
+        </w:tc>
+        <w:tc>
+          <w:tcPr>
+            <w:tcW w:type="dxa" w:w="4320"/>
+          </w:tcPr>
+          <w:p/>
+        </w:tc>
+      </w:tr>
+      <w:tr>
+        <w:tc>
+          <w:tcPr>
+            <w:tcW w:type="dxa" w:w="4320"/>
+          </w:tcPr>
+          <w:p/>
+        </w:tc>
+        <w:tc>
+          <w:tcPr>
+            <w:tcW w:type="dxa" w:w="4320"/>
+          </w:tcPr>
+          <w:p/>
+        </w:tc>
+      </w:tr>
+      <w:tr>
+        <w:tc>
+          <w:tcPr>
+            <w:tcW w:type="dxa" w:w="4320"/>
+          </w:tcPr>
+          <w:p/>
+        </w:tc>
+        <w:tc>
+          <w:tcPr>
+            <w:tcW w:type="dxa" w:w="4320"/>
+          </w:tcPr>
+          <w:p/>
+        </w:tc>
+      </w:tr>
+      <w:tr>
+        <w:tc>
+          <w:tcPr>
+            <w:tcW w:type="dxa" w:w="4320"/>
+          </w:tcPr>
+          <w:p>
+            <w:r>
+              <w:t>Caché viejo</w:t>
+            </w:r>
+          </w:p>
+        </w:tc>
+        <w:tc>
+          <w:tcPr>
+            <w:tcW w:type="dxa" w:w="4320"/>
+          </w:tcPr>
+          <w:p>
+            <w:r>
+              <w:t>&gt;24h → badge naranja, &gt;48h → rojo. Indica que los datos pueden estar desactualizados.</w:t>
+            </w:r>
+          </w:p>
+        </w:tc>
+      </w:tr>
+      <w:tr>
+        <w:tc>
+          <w:tcPr>
+            <w:tcW w:type="dxa" w:w="4320"/>
+          </w:tcPr>
+          <w:p>
+            <w:r>
+              <w:t>Earnings warning</w:t>
+            </w:r>
+          </w:p>
+        </w:tc>
+        <w:tc>
+          <w:tcPr>
+            <w:tcW w:type="dxa" w:w="4320"/>
+          </w:tcPr>
+          <w:p>
+            <w:r>
+              <w:t>&lt;7d → banner rojo (evitar entrada). 7–14d → naranja. Tabla: badge "E{días}d".</w:t>
+            </w:r>
+          </w:p>
+        </w:tc>
+      </w:tr>
+      <w:tr>
+        <w:tc>
+          <w:tcPr>
+            <w:tcW w:type="dxa" w:w="4320"/>
+          </w:tcPr>
+          <w:p>
+            <w:r>
+              <w:t>Ex-dividend warning</w:t>
+            </w:r>
+          </w:p>
+        </w:tc>
+        <w:tc>
+          <w:tcPr>
+            <w:tcW w:type="dxa" w:w="4320"/>
+          </w:tcPr>
+          <w:p>
+            <w:r>
+              <w:t>&lt;7d → rojo, 7–14d → naranja. Solo si dividendYield &gt; 0.3%.</w:t>
+            </w:r>
+          </w:p>
+        </w:tc>
+      </w:tr>
+      <w:tr>
+        <w:tc>
+          <w:tcPr>
+            <w:tcW w:type="dxa" w:w="4320"/>
+          </w:tcPr>
+          <w:p>
+            <w:r>
+              <w:t>RS SPY</w:t>
+            </w:r>
+          </w:p>
+        </w:tc>
+        <w:tc>
+          <w:tcPr>
+            <w:tcW w:type="dxa" w:w="4320"/>
+          </w:tcPr>
+          <w:p>
+            <w:r>
+              <w:t>Valor real sin cap (ej: +43% vs SPY). Antes mostraba máximo ±5.</w:t>
+            </w:r>
+          </w:p>
+        </w:tc>
+      </w:tr>
+      <w:tr>
+        <w:tc>
+          <w:tcPr>
+            <w:tcW w:type="dxa" w:w="4320"/>
+          </w:tcPr>
+          <w:p>
+            <w:r>
+              <w:t>Confidence score</w:t>
+            </w:r>
+          </w:p>
+        </w:tc>
+        <w:tc>
+          <w:tcPr>
+            <w:tcW w:type="dxa" w:w="4320"/>
+          </w:tcPr>
+          <w:p>
+            <w:r>
+              <w:t>Alta (≥6/7 criterios con datos reales), Media (4/7), Baja (&lt;4/7).</w:t>
+            </w:r>
+          </w:p>
+        </w:tc>
+      </w:tr>
+      <w:tr>
+        <w:tc>
+          <w:tcPr>
+            <w:tcW w:type="dxa" w:w="4320"/>
+          </w:tcPr>
+          <w:p>
+            <w:r>
+              <w:t>Stage badge</w:t>
+            </w:r>
+          </w:p>
+        </w:tc>
+        <w:tc>
+          <w:tcPr>
+            <w:tcW w:type="dxa" w:w="4320"/>
+          </w:tcPr>
+          <w:p>
+            <w:r>
+              <w:t>Stage 1/2/3/4 de Weinstein. Warning prominente si Stage 4.</w:t>
+            </w:r>
+          </w:p>
+        </w:tc>
+      </w:tr>
+      <w:tr>
+        <w:tc>
+          <w:tcPr>
+            <w:tcW w:type="dxa" w:w="4320"/>
+          </w:tcPr>
+          <w:p>
+            <w:r>
+              <w:t>Mercado bajista</w:t>
+            </w:r>
+          </w:p>
+        </w:tc>
+        <w:tc>
+          <w:tcPr>
+            <w:tcW w:type="dxa" w:w="4320"/>
+          </w:tcPr>
+          <w:p>
+            <w:r>
+              <w:t>Warning si SPY &lt; SMA200. Weinstein: nunca comprar Stage 2 individual en Stage 4 del mercado.</w:t>
+            </w:r>
+          </w:p>
+        </w:tc>
+      </w:tr>
+    </w:tbl>
+    <w:p>
+      <w:pPr>
+        <w:pStyle w:val="Heading2"/>
+      </w:pPr>
+      <w:r>
+        <w:t>Sizing calculator integrado</w:t>
+      </w:r>
+    </w:p>
+    <w:p>
+      <w:r>
+        <w:t>Disponible en cada PositionCard. Inputs: capital total (USD) + % de riesgo por operación (default 1%).</w:t>
+        <w:br/>
+        <w:br/>
+        <w:t>Calcula automáticamente:</w:t>
+        <w:br/>
+        <w:t>- Número de acciones = (capital × riskPct) / (entry - stop)</w:t>
+        <w:br/>
+        <w:t>- Monto invertido = acciones × precio de entrada</w:t>
+        <w:br/>
+        <w:t>- Ganancia potencial = (target - entry) × acciones</w:t>
+        <w:br/>
+        <w:t>- Pérdida máxima = (entry - stop) × acciones</w:t>
+        <w:br/>
+        <w:br/>
+        <w:t>Los precios de entry/stop/target se toman de los niveles sugeridos por el análisis. Revisar y ajustar manualmente si es necesario.</w:t>
+      </w:r>
+    </w:p>
+    <w:p>
+      <w:pPr>
+        <w:pStyle w:val="Heading2"/>
+      </w:pPr>
+      <w:r>
+        <w:t>3. Tab Mercado — Sector Rotation</w:t>
+      </w:r>
+    </w:p>
+    <w:p>
+      <w:r>
+        <w:t>Tabla de 11 sectores SPDR (XLK, XLV, XLE, XLF, XLI, XLU, XLP, XLB, XLY, XLC, XLRE) ordenados por RS Mansfield vs SPY descendente.</w:t>
+        <w:br/>
+        <w:br/>
+        <w:t>Badges TOP (verde) para los 3 primeros y WEAK (rojo) para los 3 últimos.</w:t>
+        <w:br/>
+        <w:t>Header muestra precio y posición de SPY vs SMA200. Cache 1 hora.</w:t>
+      </w:r>
+    </w:p>
+    <w:p>
+      <w:pPr>
+        <w:pStyle w:val="Heading2"/>
+      </w:pPr>
+      <w:r>
+        <w:t>4. Journal Position</w:t>
+      </w:r>
+    </w:p>
+    <w:p>
+      <w:r>
+        <w:t>Estados: planning → open → closed.</w:t>
+        <w:br/>
+        <w:t>Campos: ticker, empresa, sector, fecha entrada, precio entrada, stop, target, acciones, notas, scorecard.</w:t>
+        <w:br/>
+        <w:t>Al cerrar: precio de cierre, fecha de cierre, P&amp;L calculado automáticamente.</w:t>
+      </w:r>
+    </w:p>
+    <w:p>
+      <w:pPr>
+        <w:pStyle w:val="Heading2"/>
+      </w:pPr>
+      <w:r>
+        <w:t>5. Dashboard Position</w:t>
+      </w:r>
+    </w:p>
+    <w:p>
+      <w:r>
+        <w:t>P&amp;L mensual (barras). Win rate total. Win rate separado por tipo de decisión: CONVICCIÓN vs CAUTELA. Útil para calibrar si las operaciones con cautela merecen el riesgo.</w:t>
+      </w:r>
+    </w:p>
+    <w:p>
+      <w:pPr>
+        <w:pStyle w:val="Heading1"/>
+      </w:pPr>
+      <w:r>
+        <w:t>Lo que la app hace y no hace</w:t>
+      </w:r>
+    </w:p>
+    <w:p>
+      <w:pPr>
+        <w:pStyle w:val="Heading2"/>
+      </w:pPr>
+      <w:r>
+        <w:t>Hace bien</w:t>
       </w:r>
     </w:p>
     <w:p>
@@ -1498,7 +2525,7 @@
         <w:pStyle w:val="ListBullet"/>
       </w:pPr>
       <w:r>
-        <w:t>La app detecta automáticamente si hay ex-dividend dentro del plazo del trade y lo muestra como banner.</w:t>
+        <w:t>Identifica acciones en Stage 2 emergente (no tardío) con fundamentos sólidos y RS positiva.</w:t>
       </w:r>
     </w:p>
     <w:p>
@@ -1506,7 +2533,7 @@
         <w:pStyle w:val="ListBullet"/>
       </w:pPr>
       <w:r>
-        <w:t>Si el ex-dividend ocurre antes de que el trade alcance el objetivo, el precio puede no llegar a la meta.</w:t>
+        <w:t>Distingue empresa buena de entrada técnica buena (AAPL fundamentales excelentes pero Stage 3 = NO OPERAR).</w:t>
       </w:r>
     </w:p>
     <w:p>
@@ -1514,7 +2541,7 @@
         <w:pStyle w:val="ListBullet"/>
       </w:pPr>
       <w:r>
-        <w:t>Las estrellas de contexto penalizan automáticamente: -2★ si ex-dividend ≤5 días (yield&gt;0.3%), -1★ si ex-dividend cae dentro del 40% del plazo del trade.</w:t>
+        <w:t>Calcula stop técnicamente válido (base semanal real, no % arbitrario).</w:t>
       </w:r>
     </w:p>
     <w:p>
@@ -1522,7 +2549,7 @@
         <w:pStyle w:val="ListBullet"/>
       </w:pPr>
       <w:r>
-        <w:t>Claude también lo considera al calcular niveles técnicos y el análisis narrativo.</w:t>
+        <w:t>Fuerza disciplina R/R 2.5x en cada operación.</w:t>
       </w:r>
     </w:p>
     <w:p>
@@ -1530,7 +2557,7 @@
         <w:pStyle w:val="ListBullet"/>
       </w:pPr>
       <w:r>
-        <w:t>Recomendación: si el ex-dividend cae dentro del plazo del trade, reducir el tamaño de la posición o esperar a que pase la fecha antes de entrar.</w:t>
+        <w:t>Penaliza entradas en mercado bajista (Weinstein: nunca comprar Stage 2 individual en Stage 4 de mercado).</w:t>
       </w:r>
     </w:p>
     <w:p>
@@ -1538,7 +2565,7 @@
         <w:pStyle w:val="Heading2"/>
       </w:pPr>
       <w:r>
-        <w:t>8. Configuración OCO en el broker (IBKR)</w:t>
+        <w:t>Revisar manualmente antes de ejecutar</w:t>
       </w:r>
     </w:p>
     <w:p>
@@ -1546,7 +2573,7 @@
         <w:pStyle w:val="ListBullet"/>
       </w:pPr>
       <w:r>
-        <w:t>Usar Bracket Order (Entry + Profit Taker + Stop Loss) en una sola orden.</w:t>
+        <w:t>Noticias recientes del ticker (earnings, aranceles, cambios de guidance).</w:t>
       </w:r>
     </w:p>
     <w:p>
@@ -1554,7 +2581,7 @@
         <w:pStyle w:val="ListBullet"/>
       </w:pPr>
       <w:r>
-        <w:t>Stop-loss: precio calculado por la app (mínimo 20 días × 0.995).</w:t>
+        <w:t>Volumen intradiario en tiempo real (15 min delay).</w:t>
       </w:r>
     </w:p>
     <w:p>
@@ -1562,7 +2589,7 @@
         <w:pStyle w:val="ListBullet"/>
       </w:pPr>
       <w:r>
-        <w:t>Take profit: precio target calculado por la app (R:B mínimo 2.5x).</w:t>
+        <w:t>Decisión de % del portafolio total a concentrar en una posición.</w:t>
       </w:r>
     </w:p>
     <w:p>
@@ -1570,215 +2597,7 @@
         <w:pStyle w:val="ListBullet"/>
       </w:pPr>
       <w:r>
-        <w:t>No modificar manualmente el stop antes de que el precio supere el punto de breakeven.</w:t>
-      </w:r>
-    </w:p>
-    <w:p>
-      <w:pPr>
-        <w:pStyle w:val="Heading2"/>
-      </w:pPr>
-      <w:r>
-        <w:t>9. Mini chart en tarjetas</w:t>
-      </w:r>
-    </w:p>
-    <w:p>
-      <w:pPr>
-        <w:pStyle w:val="ListBullet"/>
-      </w:pPr>
-      <w:r>
-        <w:t>Cada tarjeta incluye un gráfico sparkline de los últimos 30 días con la línea de precio (azul) y SMA21 (naranja).</w:t>
-      </w:r>
-    </w:p>
-    <w:p>
-      <w:pPr>
-        <w:pStyle w:val="ListBullet"/>
-      </w:pPr>
-      <w:r>
-        <w:t>La banda verde sombreada indica la zona de entrada (rango entryLow–entryHigh).</w:t>
-      </w:r>
-    </w:p>
-    <w:p>
-      <w:pPr>
-        <w:pStyle w:val="ListBullet"/>
-      </w:pPr>
-      <w:r>
-        <w:t>Las líneas punteadas muestran el Stop-Loss (rojo) y el Target (verde).</w:t>
-      </w:r>
-    </w:p>
-    <w:p>
-      <w:pPr>
-        <w:pStyle w:val="ListBullet"/>
-      </w:pPr>
-      <w:r>
-        <w:t>Botón ⤢ en la esquina inferior derecha del gráfico: abre el chart ampliado en modal.</w:t>
-      </w:r>
-    </w:p>
-    <w:p>
-      <w:pPr>
-        <w:pStyle w:val="ListBullet"/>
-      </w:pPr>
-      <w:r>
-        <w:t>En el modal: escala de precios en el eje derecho, grid de referencia y crosshair interactivo — al pasar el cursor aparece una línea vertical y horizontal que señalan el punto exacto con precio y SMA21.</w:t>
-      </w:r>
-    </w:p>
-    <w:p>
-      <w:pPr>
-        <w:pStyle w:val="ListBullet"/>
-      </w:pPr>
-      <w:r>
-        <w:t>Debajo del gráfico: leyenda con colores de cada línea.</w:t>
-      </w:r>
-    </w:p>
-    <w:p>
-      <w:pPr>
-        <w:pStyle w:val="Heading2"/>
-      </w:pPr>
-      <w:r>
-        <w:t>10. Vista tabla comparativa</w:t>
-      </w:r>
-    </w:p>
-    <w:p>
-      <w:pPr>
-        <w:pStyle w:val="ListBullet"/>
-      </w:pPr>
-      <w:r>
-        <w:t>Botón ☰ (tabla) / ⊞ (tarjetas) en la barra de cada pestaña para cambiar la vista. Cada pestaña recuerda su propia vista de forma independiente.</w:t>
-      </w:r>
-    </w:p>
-    <w:p>
-      <w:pPr>
-        <w:pStyle w:val="ListBullet"/>
-      </w:pPr>
-      <w:r>
-        <w:t>La tabla muestra: Ticker, Precio, Score, Señal, RSI, Zona entrada, Dist. rango y R:B.</w:t>
-      </w:r>
-    </w:p>
-    <w:p>
-      <w:pPr>
-        <w:pStyle w:val="ListBullet"/>
-      </w:pPr>
-      <w:r>
-        <w:t>"Dist. rango": indica qué tan lejos está el precio del rango de entrada. "En rango" (verde) es el momento ideal de entrada.</w:t>
-      </w:r>
-    </w:p>
-    <w:p>
-      <w:pPr>
-        <w:pStyle w:val="ListBullet"/>
-      </w:pPr>
-      <w:r>
-        <w:t>Bajo el ticker aparece la antigüedad del análisis: "hoy", "ayer" o "hace Xd".</w:t>
-      </w:r>
-    </w:p>
-    <w:p>
-      <w:pPr>
-        <w:pStyle w:val="ListBullet"/>
-      </w:pPr>
-      <w:r>
-        <w:t>Ordenar: click en cualquier cabecera de columna. Click repetido invierte el orden.</w:t>
-      </w:r>
-    </w:p>
-    <w:p>
-      <w:pPr>
-        <w:pStyle w:val="ListBullet"/>
-      </w:pPr>
-      <w:r>
-        <w:t>Filtrar: buscador por nombre de ticker y botones de señal (COMPRAR, MONITOREAR, ESPERAR, EVITAR). Se pueden combinar.</w:t>
-      </w:r>
-    </w:p>
-    <w:p>
-      <w:pPr>
-        <w:pStyle w:val="ListBullet"/>
-      </w:pPr>
-      <w:r>
-        <w:t>Botón ↻ en cada fila: actualiza el análisis de ese ticker en segundo plano sin abrir ningún popup.</w:t>
-      </w:r>
-    </w:p>
-    <w:p>
-      <w:pPr>
-        <w:pStyle w:val="ListBullet"/>
-      </w:pPr>
-      <w:r>
-        <w:t>Botón × en cada fila: elimina el ticker de la watchlist.</w:t>
-      </w:r>
-    </w:p>
-    <w:p>
-      <w:pPr>
-        <w:pStyle w:val="ListBullet"/>
-      </w:pPr>
-      <w:r>
-        <w:t>Click en cualquier fila: abre la tarjeta completa de ese ticker en un modal.</w:t>
-      </w:r>
-    </w:p>
-    <w:p>
-      <w:pPr>
-        <w:pStyle w:val="Heading2"/>
-      </w:pPr>
-      <w:r>
-        <w:t>11. Análisis persistente entre sesiones</w:t>
-      </w:r>
-    </w:p>
-    <w:p>
-      <w:pPr>
-        <w:pStyle w:val="ListBullet"/>
-      </w:pPr>
-      <w:r>
-        <w:t>Los análisis se guardan automáticamente en la nube al analizar cualquier ticker.</w:t>
-      </w:r>
-    </w:p>
-    <w:p>
-      <w:pPr>
-        <w:pStyle w:val="ListBullet"/>
-      </w:pPr>
-      <w:r>
-        <w:t>Al recargar la página o volver a entrar, las tarjetas muestran los datos del último análisis sin necesidad de re-analizar.</w:t>
-      </w:r>
-    </w:p>
-    <w:p>
-      <w:pPr>
-        <w:pStyle w:val="ListBullet"/>
-      </w:pPr>
-      <w:r>
-        <w:t>La fecha de actualización aparece en cada tarjeta ("Actualizado hoy/ayer/hace Xd") y en la tabla.</w:t>
-      </w:r>
-    </w:p>
-    <w:p>
-      <w:pPr>
-        <w:pStyle w:val="ListBullet"/>
-      </w:pPr>
-      <w:r>
-        <w:t>Para obtener datos frescos, usar el botón ↻ en la tarjeta o en la tabla.</w:t>
-      </w:r>
-    </w:p>
-    <w:p>
-      <w:pPr>
-        <w:pStyle w:val="Heading2"/>
-      </w:pPr>
-      <w:r>
-        <w:t>12. Búsqueda por ticker en Journal</w:t>
-      </w:r>
-    </w:p>
-    <w:p>
-      <w:pPr>
-        <w:pStyle w:val="ListBullet"/>
-      </w:pPr>
-      <w:r>
-        <w:t>Input de búsqueda en la barra de filtros del Journal (esquina derecha).</w:t>
-      </w:r>
-    </w:p>
-    <w:p>
-      <w:pPr>
-        <w:pStyle w:val="ListBullet"/>
-      </w:pPr>
-      <w:r>
-        <w:t>Filtra instantáneamente mientras escribes y se combina con el filtro de estado activo.</w:t>
-      </w:r>
-    </w:p>
-    <w:p>
-      <w:pPr>
-        <w:pStyle w:val="ListBullet"/>
-      </w:pPr>
-      <w:r>
-        <w:t>Botón × limpia la búsqueda. Contador de resultados visible mientras hay filtro activo.</w:t>
+        <w:t>Haiku no conoce eventos recientes — el prompt usa datos históricos de AV.</w:t>
       </w:r>
     </w:p>
     <w:sectPr>

</xml_diff>